<commit_message>
Apply 1.5 line spacing to bullet lists too (school spec compliance)
Body text already 1.5 via Normal style; bullet/quote paragraphs now explicitly
1.5. Headings and table cells remain single-spaced per academic convention.

Co-Authored-By: Claude Opus 4.8 <noreply@anthropic.com>
</commit_message>
<xml_diff>
--- a/Dissertation_Coquet_FINAL.docx
+++ b/Dissertation_Coquet_FINAL.docx
@@ -296,6 +296,7 @@
     <w:p>
       <w:pPr>
         <w:pStyle w:val="ListBullet"/>
+        <w:spacing w:line="360" w:lineRule="auto"/>
       </w:pPr>
       <w:r>
         <w:rPr>
@@ -315,6 +316,7 @@
     <w:p>
       <w:pPr>
         <w:pStyle w:val="ListBullet"/>
+        <w:spacing w:line="360" w:lineRule="auto"/>
       </w:pPr>
       <w:r>
         <w:rPr>
@@ -334,6 +336,7 @@
     <w:p>
       <w:pPr>
         <w:pStyle w:val="ListBullet"/>
+        <w:spacing w:line="360" w:lineRule="auto"/>
       </w:pPr>
       <w:r>
         <w:rPr>
@@ -353,6 +356,7 @@
     <w:p>
       <w:pPr>
         <w:pStyle w:val="ListBullet"/>
+        <w:spacing w:line="360" w:lineRule="auto"/>
       </w:pPr>
       <w:r>
         <w:rPr>
@@ -372,6 +376,7 @@
     <w:p>
       <w:pPr>
         <w:pStyle w:val="ListBullet"/>
+        <w:spacing w:line="360" w:lineRule="auto"/>
       </w:pPr>
       <w:r>
         <w:rPr>
@@ -391,6 +396,7 @@
     <w:p>
       <w:pPr>
         <w:pStyle w:val="ListBullet"/>
+        <w:spacing w:line="360" w:lineRule="auto"/>
       </w:pPr>
       <w:r>
         <w:rPr>
@@ -410,6 +416,7 @@
     <w:p>
       <w:pPr>
         <w:pStyle w:val="ListBullet"/>
+        <w:spacing w:line="360" w:lineRule="auto"/>
       </w:pPr>
       <w:r>
         <w:rPr>
@@ -429,6 +436,7 @@
     <w:p>
       <w:pPr>
         <w:pStyle w:val="ListBullet"/>
+        <w:spacing w:line="360" w:lineRule="auto"/>
       </w:pPr>
       <w:r>
         <w:rPr>
@@ -448,6 +456,7 @@
     <w:p>
       <w:pPr>
         <w:pStyle w:val="ListBullet"/>
+        <w:spacing w:line="360" w:lineRule="auto"/>
       </w:pPr>
       <w:r>
         <w:rPr>
@@ -467,6 +476,7 @@
     <w:p>
       <w:pPr>
         <w:pStyle w:val="ListBullet"/>
+        <w:spacing w:line="360" w:lineRule="auto"/>
       </w:pPr>
       <w:r>
         <w:rPr>
@@ -486,6 +496,7 @@
     <w:p>
       <w:pPr>
         <w:pStyle w:val="ListBullet"/>
+        <w:spacing w:line="360" w:lineRule="auto"/>
       </w:pPr>
       <w:r>
         <w:rPr>
@@ -505,6 +516,7 @@
     <w:p>
       <w:pPr>
         <w:pStyle w:val="ListBullet"/>
+        <w:spacing w:line="360" w:lineRule="auto"/>
       </w:pPr>
       <w:r>
         <w:rPr>
@@ -524,6 +536,7 @@
     <w:p>
       <w:pPr>
         <w:pStyle w:val="ListBullet"/>
+        <w:spacing w:line="360" w:lineRule="auto"/>
       </w:pPr>
       <w:r>
         <w:rPr>
@@ -543,6 +556,7 @@
     <w:p>
       <w:pPr>
         <w:pStyle w:val="ListBullet"/>
+        <w:spacing w:line="360" w:lineRule="auto"/>
       </w:pPr>
       <w:r>
         <w:rPr>
@@ -562,6 +576,7 @@
     <w:p>
       <w:pPr>
         <w:pStyle w:val="ListBullet"/>
+        <w:spacing w:line="360" w:lineRule="auto"/>
       </w:pPr>
       <w:r>
         <w:rPr>
@@ -581,6 +596,7 @@
     <w:p>
       <w:pPr>
         <w:pStyle w:val="ListBullet"/>
+        <w:spacing w:line="360" w:lineRule="auto"/>
       </w:pPr>
       <w:r>
         <w:rPr>
@@ -600,6 +616,7 @@
     <w:p>
       <w:pPr>
         <w:pStyle w:val="ListBullet"/>
+        <w:spacing w:line="360" w:lineRule="auto"/>
       </w:pPr>
       <w:r>
         <w:rPr>
@@ -619,6 +636,7 @@
     <w:p>
       <w:pPr>
         <w:pStyle w:val="ListBullet"/>
+        <w:spacing w:line="360" w:lineRule="auto"/>
       </w:pPr>
       <w:r>
         <w:rPr>
@@ -638,6 +656,7 @@
     <w:p>
       <w:pPr>
         <w:pStyle w:val="ListBullet"/>
+        <w:spacing w:line="360" w:lineRule="auto"/>
       </w:pPr>
       <w:r>
         <w:rPr>
@@ -859,6 +878,7 @@
     </w:p>
     <w:p>
       <w:pPr>
+        <w:spacing w:line="360" w:lineRule="auto"/>
         <w:ind w:left="576"/>
       </w:pPr>
       <w:r>
@@ -884,6 +904,7 @@
     <w:p>
       <w:pPr>
         <w:pStyle w:val="ListBullet"/>
+        <w:spacing w:line="360" w:lineRule="auto"/>
       </w:pPr>
       <w:r>
         <w:rPr>
@@ -903,6 +924,7 @@
     <w:p>
       <w:pPr>
         <w:pStyle w:val="ListBullet"/>
+        <w:spacing w:line="360" w:lineRule="auto"/>
       </w:pPr>
       <w:r>
         <w:rPr>
@@ -922,6 +944,7 @@
     <w:p>
       <w:pPr>
         <w:pStyle w:val="ListBullet"/>
+        <w:spacing w:line="360" w:lineRule="auto"/>
       </w:pPr>
       <w:r>
         <w:rPr>
@@ -2100,6 +2123,7 @@
     <w:p>
       <w:pPr>
         <w:pStyle w:val="ListBullet"/>
+        <w:spacing w:line="360" w:lineRule="auto"/>
       </w:pPr>
       <w:r>
         <w:rPr>
@@ -2119,6 +2143,7 @@
     <w:p>
       <w:pPr>
         <w:pStyle w:val="ListBullet"/>
+        <w:spacing w:line="360" w:lineRule="auto"/>
       </w:pPr>
       <w:r>
         <w:rPr>
@@ -2138,6 +2163,7 @@
     <w:p>
       <w:pPr>
         <w:pStyle w:val="ListBullet"/>
+        <w:spacing w:line="360" w:lineRule="auto"/>
       </w:pPr>
       <w:r>
         <w:rPr>
@@ -2157,6 +2183,7 @@
     <w:p>
       <w:pPr>
         <w:pStyle w:val="ListBullet"/>
+        <w:spacing w:line="360" w:lineRule="auto"/>
       </w:pPr>
       <w:r>
         <w:rPr>
@@ -2176,6 +2203,7 @@
     <w:p>
       <w:pPr>
         <w:pStyle w:val="ListBullet"/>
+        <w:spacing w:line="360" w:lineRule="auto"/>
       </w:pPr>
       <w:r>
         <w:rPr>
@@ -2195,6 +2223,7 @@
     <w:p>
       <w:pPr>
         <w:pStyle w:val="ListBullet"/>
+        <w:spacing w:line="360" w:lineRule="auto"/>
       </w:pPr>
       <w:r>
         <w:rPr>
@@ -2292,6 +2321,7 @@
     <w:p>
       <w:pPr>
         <w:pStyle w:val="ListBullet"/>
+        <w:spacing w:line="360" w:lineRule="auto"/>
       </w:pPr>
       <w:r>
         <w:rPr>
@@ -2311,6 +2341,7 @@
     <w:p>
       <w:pPr>
         <w:pStyle w:val="ListBullet"/>
+        <w:spacing w:line="360" w:lineRule="auto"/>
       </w:pPr>
       <w:r>
         <w:rPr>
@@ -2330,6 +2361,7 @@
     <w:p>
       <w:pPr>
         <w:pStyle w:val="ListBullet"/>
+        <w:spacing w:line="360" w:lineRule="auto"/>
       </w:pPr>
       <w:r>
         <w:rPr>
@@ -2349,6 +2381,7 @@
     <w:p>
       <w:pPr>
         <w:pStyle w:val="ListBullet"/>
+        <w:spacing w:line="360" w:lineRule="auto"/>
       </w:pPr>
       <w:r>
         <w:rPr>
@@ -2368,6 +2401,7 @@
     <w:p>
       <w:pPr>
         <w:pStyle w:val="ListBullet"/>
+        <w:spacing w:line="360" w:lineRule="auto"/>
       </w:pPr>
       <w:r>
         <w:rPr>
@@ -2387,6 +2421,7 @@
     <w:p>
       <w:pPr>
         <w:pStyle w:val="ListBullet"/>
+        <w:spacing w:line="360" w:lineRule="auto"/>
       </w:pPr>
       <w:r>
         <w:rPr>
@@ -2406,6 +2441,7 @@
     <w:p>
       <w:pPr>
         <w:pStyle w:val="ListBullet"/>
+        <w:spacing w:line="360" w:lineRule="auto"/>
       </w:pPr>
       <w:r>
         <w:rPr>
@@ -3010,6 +3046,7 @@
     </w:p>
     <w:p>
       <w:pPr>
+        <w:spacing w:line="360" w:lineRule="auto"/>
         <w:ind w:left="576"/>
       </w:pPr>
       <w:r>
@@ -3081,6 +3118,7 @@
     </w:p>
     <w:p>
       <w:pPr>
+        <w:spacing w:line="360" w:lineRule="auto"/>
         <w:ind w:left="576"/>
       </w:pPr>
       <w:r>
@@ -3152,6 +3190,7 @@
     </w:p>
     <w:p>
       <w:pPr>
+        <w:spacing w:line="360" w:lineRule="auto"/>
         <w:ind w:left="576"/>
       </w:pPr>
       <w:r>
@@ -3343,6 +3382,7 @@
     <w:p>
       <w:pPr>
         <w:pStyle w:val="ListBullet"/>
+        <w:spacing w:line="360" w:lineRule="auto"/>
       </w:pPr>
       <w:r>
         <w:rPr>
@@ -3376,6 +3416,7 @@
     <w:p>
       <w:pPr>
         <w:pStyle w:val="ListBullet"/>
+        <w:spacing w:line="360" w:lineRule="auto"/>
       </w:pPr>
       <w:r>
         <w:rPr>
@@ -3409,6 +3450,7 @@
     <w:p>
       <w:pPr>
         <w:pStyle w:val="ListBullet"/>
+        <w:spacing w:line="360" w:lineRule="auto"/>
       </w:pPr>
       <w:r>
         <w:rPr>
@@ -3442,6 +3484,7 @@
     <w:p>
       <w:pPr>
         <w:pStyle w:val="ListBullet"/>
+        <w:spacing w:line="360" w:lineRule="auto"/>
       </w:pPr>
       <w:r>
         <w:rPr>
@@ -3475,6 +3518,7 @@
     <w:p>
       <w:pPr>
         <w:pStyle w:val="ListBullet"/>
+        <w:spacing w:line="360" w:lineRule="auto"/>
       </w:pPr>
       <w:r>
         <w:rPr>
@@ -3494,6 +3538,7 @@
     <w:p>
       <w:pPr>
         <w:pStyle w:val="ListBullet"/>
+        <w:spacing w:line="360" w:lineRule="auto"/>
       </w:pPr>
       <w:r>
         <w:rPr>
@@ -8984,6 +9029,7 @@
     <w:p>
       <w:pPr>
         <w:pStyle w:val="ListBullet"/>
+        <w:spacing w:line="360" w:lineRule="auto"/>
       </w:pPr>
       <w:r>
         <w:rPr>
@@ -8996,6 +9042,7 @@
     <w:p>
       <w:pPr>
         <w:pStyle w:val="ListBullet"/>
+        <w:spacing w:line="360" w:lineRule="auto"/>
       </w:pPr>
       <w:r>
         <w:rPr>
@@ -9008,6 +9055,7 @@
     <w:p>
       <w:pPr>
         <w:pStyle w:val="ListBullet"/>
+        <w:spacing w:line="360" w:lineRule="auto"/>
       </w:pPr>
       <w:r>
         <w:rPr>
@@ -9020,6 +9068,7 @@
     <w:p>
       <w:pPr>
         <w:pStyle w:val="ListBullet"/>
+        <w:spacing w:line="360" w:lineRule="auto"/>
       </w:pPr>
       <w:r>
         <w:rPr>
@@ -9032,6 +9081,7 @@
     <w:p>
       <w:pPr>
         <w:pStyle w:val="ListBullet"/>
+        <w:spacing w:line="360" w:lineRule="auto"/>
       </w:pPr>
       <w:r>
         <w:rPr>
@@ -9044,6 +9094,7 @@
     <w:p>
       <w:pPr>
         <w:pStyle w:val="ListBullet"/>
+        <w:spacing w:line="360" w:lineRule="auto"/>
       </w:pPr>
       <w:r>
         <w:rPr>
@@ -9056,6 +9107,7 @@
     <w:p>
       <w:pPr>
         <w:pStyle w:val="ListBullet"/>
+        <w:spacing w:line="360" w:lineRule="auto"/>
       </w:pPr>
       <w:r>
         <w:rPr>
@@ -9068,6 +9120,7 @@
     <w:p>
       <w:pPr>
         <w:pStyle w:val="ListBullet"/>
+        <w:spacing w:line="360" w:lineRule="auto"/>
       </w:pPr>
       <w:r>
         <w:rPr>
@@ -9080,6 +9133,7 @@
     <w:p>
       <w:pPr>
         <w:pStyle w:val="ListBullet"/>
+        <w:spacing w:line="360" w:lineRule="auto"/>
       </w:pPr>
       <w:r>
         <w:rPr>
@@ -9092,6 +9146,7 @@
     <w:p>
       <w:pPr>
         <w:pStyle w:val="ListBullet"/>
+        <w:spacing w:line="360" w:lineRule="auto"/>
       </w:pPr>
       <w:r>
         <w:rPr>
@@ -9104,6 +9159,7 @@
     <w:p>
       <w:pPr>
         <w:pStyle w:val="ListBullet"/>
+        <w:spacing w:line="360" w:lineRule="auto"/>
       </w:pPr>
       <w:r>
         <w:rPr>
@@ -9116,6 +9172,7 @@
     <w:p>
       <w:pPr>
         <w:pStyle w:val="ListBullet"/>
+        <w:spacing w:line="360" w:lineRule="auto"/>
       </w:pPr>
       <w:r>
         <w:rPr>
@@ -9128,6 +9185,7 @@
     <w:p>
       <w:pPr>
         <w:pStyle w:val="ListBullet"/>
+        <w:spacing w:line="360" w:lineRule="auto"/>
       </w:pPr>
       <w:r>
         <w:rPr>
@@ -9140,6 +9198,7 @@
     <w:p>
       <w:pPr>
         <w:pStyle w:val="ListBullet"/>
+        <w:spacing w:line="360" w:lineRule="auto"/>
       </w:pPr>
       <w:r>
         <w:rPr>
@@ -9152,6 +9211,7 @@
     <w:p>
       <w:pPr>
         <w:pStyle w:val="ListBullet"/>
+        <w:spacing w:line="360" w:lineRule="auto"/>
       </w:pPr>
       <w:r>
         <w:rPr>
@@ -9164,6 +9224,7 @@
     <w:p>
       <w:pPr>
         <w:pStyle w:val="ListBullet"/>
+        <w:spacing w:line="360" w:lineRule="auto"/>
       </w:pPr>
       <w:r>
         <w:rPr>
@@ -9176,6 +9237,7 @@
     <w:p>
       <w:pPr>
         <w:pStyle w:val="ListBullet"/>
+        <w:spacing w:line="360" w:lineRule="auto"/>
       </w:pPr>
       <w:r>
         <w:rPr>
@@ -9188,6 +9250,7 @@
     <w:p>
       <w:pPr>
         <w:pStyle w:val="ListBullet"/>
+        <w:spacing w:line="360" w:lineRule="auto"/>
       </w:pPr>
       <w:r>
         <w:rPr>
@@ -9200,6 +9263,7 @@
     <w:p>
       <w:pPr>
         <w:pStyle w:val="ListBullet"/>
+        <w:spacing w:line="360" w:lineRule="auto"/>
       </w:pPr>
       <w:r>
         <w:rPr>
@@ -9212,6 +9276,7 @@
     <w:p>
       <w:pPr>
         <w:pStyle w:val="ListBullet"/>
+        <w:spacing w:line="360" w:lineRule="auto"/>
       </w:pPr>
       <w:r>
         <w:rPr>
@@ -9224,6 +9289,7 @@
     <w:p>
       <w:pPr>
         <w:pStyle w:val="ListBullet"/>
+        <w:spacing w:line="360" w:lineRule="auto"/>
       </w:pPr>
       <w:r>
         <w:rPr>
@@ -9236,6 +9302,7 @@
     <w:p>
       <w:pPr>
         <w:pStyle w:val="ListBullet"/>
+        <w:spacing w:line="360" w:lineRule="auto"/>
       </w:pPr>
       <w:r>
         <w:rPr>
@@ -9248,6 +9315,7 @@
     <w:p>
       <w:pPr>
         <w:pStyle w:val="ListBullet"/>
+        <w:spacing w:line="360" w:lineRule="auto"/>
       </w:pPr>
       <w:r>
         <w:rPr>
@@ -9260,6 +9328,7 @@
     <w:p>
       <w:pPr>
         <w:pStyle w:val="ListBullet"/>
+        <w:spacing w:line="360" w:lineRule="auto"/>
       </w:pPr>
       <w:r>
         <w:rPr>
@@ -9272,6 +9341,7 @@
     <w:p>
       <w:pPr>
         <w:pStyle w:val="ListBullet"/>
+        <w:spacing w:line="360" w:lineRule="auto"/>
       </w:pPr>
       <w:r>
         <w:rPr>
@@ -9284,6 +9354,7 @@
     <w:p>
       <w:pPr>
         <w:pStyle w:val="ListBullet"/>
+        <w:spacing w:line="360" w:lineRule="auto"/>
       </w:pPr>
       <w:r>
         <w:rPr>
@@ -9296,6 +9367,7 @@
     <w:p>
       <w:pPr>
         <w:pStyle w:val="ListBullet"/>
+        <w:spacing w:line="360" w:lineRule="auto"/>
       </w:pPr>
       <w:r>
         <w:rPr>
@@ -9308,6 +9380,7 @@
     <w:p>
       <w:pPr>
         <w:pStyle w:val="ListBullet"/>
+        <w:spacing w:line="360" w:lineRule="auto"/>
       </w:pPr>
       <w:r>
         <w:rPr>
@@ -9320,6 +9393,7 @@
     <w:p>
       <w:pPr>
         <w:pStyle w:val="ListBullet"/>
+        <w:spacing w:line="360" w:lineRule="auto"/>
       </w:pPr>
       <w:r>
         <w:rPr>
@@ -9332,6 +9406,7 @@
     <w:p>
       <w:pPr>
         <w:pStyle w:val="ListBullet"/>
+        <w:spacing w:line="360" w:lineRule="auto"/>
       </w:pPr>
       <w:r>
         <w:rPr>
@@ -9344,6 +9419,7 @@
     <w:p>
       <w:pPr>
         <w:pStyle w:val="ListBullet"/>
+        <w:spacing w:line="360" w:lineRule="auto"/>
       </w:pPr>
       <w:r>
         <w:rPr>
@@ -9356,6 +9432,7 @@
     <w:p>
       <w:pPr>
         <w:pStyle w:val="ListBullet"/>
+        <w:spacing w:line="360" w:lineRule="auto"/>
       </w:pPr>
       <w:r>
         <w:rPr>
@@ -9368,6 +9445,7 @@
     <w:p>
       <w:pPr>
         <w:pStyle w:val="ListBullet"/>
+        <w:spacing w:line="360" w:lineRule="auto"/>
       </w:pPr>
       <w:r>
         <w:rPr>
@@ -9380,6 +9458,7 @@
     <w:p>
       <w:pPr>
         <w:pStyle w:val="ListBullet"/>
+        <w:spacing w:line="360" w:lineRule="auto"/>
       </w:pPr>
       <w:r>
         <w:rPr>
@@ -9392,6 +9471,7 @@
     <w:p>
       <w:pPr>
         <w:pStyle w:val="ListBullet"/>
+        <w:spacing w:line="360" w:lineRule="auto"/>
       </w:pPr>
       <w:r>
         <w:rPr>
@@ -9404,6 +9484,7 @@
     <w:p>
       <w:pPr>
         <w:pStyle w:val="ListBullet"/>
+        <w:spacing w:line="360" w:lineRule="auto"/>
       </w:pPr>
       <w:r>
         <w:rPr>
@@ -9416,6 +9497,7 @@
     <w:p>
       <w:pPr>
         <w:pStyle w:val="ListBullet"/>
+        <w:spacing w:line="360" w:lineRule="auto"/>
       </w:pPr>
       <w:r>
         <w:rPr>
@@ -9428,6 +9510,7 @@
     <w:p>
       <w:pPr>
         <w:pStyle w:val="ListBullet"/>
+        <w:spacing w:line="360" w:lineRule="auto"/>
       </w:pPr>
       <w:r>
         <w:rPr>
@@ -9440,6 +9523,7 @@
     <w:p>
       <w:pPr>
         <w:pStyle w:val="ListBullet"/>
+        <w:spacing w:line="360" w:lineRule="auto"/>
       </w:pPr>
       <w:r>
         <w:rPr>
@@ -9452,6 +9536,7 @@
     <w:p>
       <w:pPr>
         <w:pStyle w:val="ListBullet"/>
+        <w:spacing w:line="360" w:lineRule="auto"/>
       </w:pPr>
       <w:r>
         <w:rPr>
@@ -9464,6 +9549,7 @@
     <w:p>
       <w:pPr>
         <w:pStyle w:val="ListBullet"/>
+        <w:spacing w:line="360" w:lineRule="auto"/>
       </w:pPr>
       <w:r>
         <w:rPr>
@@ -9476,6 +9562,7 @@
     <w:p>
       <w:pPr>
         <w:pStyle w:val="ListBullet"/>
+        <w:spacing w:line="360" w:lineRule="auto"/>
       </w:pPr>
       <w:r>
         <w:rPr>
@@ -9488,6 +9575,7 @@
     <w:p>
       <w:pPr>
         <w:pStyle w:val="ListBullet"/>
+        <w:spacing w:line="360" w:lineRule="auto"/>
       </w:pPr>
       <w:r>
         <w:rPr>
@@ -9500,6 +9588,7 @@
     <w:p>
       <w:pPr>
         <w:pStyle w:val="ListBullet"/>
+        <w:spacing w:line="360" w:lineRule="auto"/>
       </w:pPr>
       <w:r>
         <w:rPr>
@@ -9512,6 +9601,7 @@
     <w:p>
       <w:pPr>
         <w:pStyle w:val="ListBullet"/>
+        <w:spacing w:line="360" w:lineRule="auto"/>
       </w:pPr>
       <w:r>
         <w:rPr>
@@ -9524,6 +9614,7 @@
     <w:p>
       <w:pPr>
         <w:pStyle w:val="ListBullet"/>
+        <w:spacing w:line="360" w:lineRule="auto"/>
       </w:pPr>
       <w:r>
         <w:rPr>
@@ -9536,6 +9627,7 @@
     <w:p>
       <w:pPr>
         <w:pStyle w:val="ListBullet"/>
+        <w:spacing w:line="360" w:lineRule="auto"/>
       </w:pPr>
       <w:r>
         <w:rPr>
@@ -9548,6 +9640,7 @@
     <w:p>
       <w:pPr>
         <w:pStyle w:val="ListBullet"/>
+        <w:spacing w:line="360" w:lineRule="auto"/>
       </w:pPr>
       <w:r>
         <w:rPr>
@@ -9560,6 +9653,7 @@
     <w:p>
       <w:pPr>
         <w:pStyle w:val="ListBullet"/>
+        <w:spacing w:line="360" w:lineRule="auto"/>
       </w:pPr>
       <w:r>
         <w:rPr>
@@ -14362,6 +14456,7 @@
     <w:p>
       <w:pPr>
         <w:pStyle w:val="ListBullet"/>
+        <w:spacing w:line="360" w:lineRule="auto"/>
       </w:pPr>
       <w:r>
         <w:rPr>
@@ -14374,6 +14469,7 @@
     <w:p>
       <w:pPr>
         <w:pStyle w:val="ListBullet"/>
+        <w:spacing w:line="360" w:lineRule="auto"/>
       </w:pPr>
       <w:r>
         <w:rPr>
@@ -14386,6 +14482,7 @@
     <w:p>
       <w:pPr>
         <w:pStyle w:val="ListBullet"/>
+        <w:spacing w:line="360" w:lineRule="auto"/>
       </w:pPr>
       <w:r>
         <w:rPr>
@@ -14398,6 +14495,7 @@
     <w:p>
       <w:pPr>
         <w:pStyle w:val="ListBullet"/>
+        <w:spacing w:line="360" w:lineRule="auto"/>
       </w:pPr>
       <w:r>
         <w:rPr>
@@ -14410,6 +14508,7 @@
     <w:p>
       <w:pPr>
         <w:pStyle w:val="ListBullet"/>
+        <w:spacing w:line="360" w:lineRule="auto"/>
       </w:pPr>
       <w:r>
         <w:rPr>
@@ -14422,6 +14521,7 @@
     <w:p>
       <w:pPr>
         <w:pStyle w:val="ListBullet"/>
+        <w:spacing w:line="360" w:lineRule="auto"/>
       </w:pPr>
       <w:r>
         <w:rPr>
@@ -14434,6 +14534,7 @@
     <w:p>
       <w:pPr>
         <w:pStyle w:val="ListBullet"/>
+        <w:spacing w:line="360" w:lineRule="auto"/>
       </w:pPr>
       <w:r>
         <w:rPr>
@@ -14446,6 +14547,7 @@
     <w:p>
       <w:pPr>
         <w:pStyle w:val="ListBullet"/>
+        <w:spacing w:line="360" w:lineRule="auto"/>
       </w:pPr>
       <w:r>
         <w:rPr>
@@ -14458,6 +14560,7 @@
     <w:p>
       <w:pPr>
         <w:pStyle w:val="ListBullet"/>
+        <w:spacing w:line="360" w:lineRule="auto"/>
       </w:pPr>
       <w:r>
         <w:rPr>
@@ -14470,6 +14573,7 @@
     <w:p>
       <w:pPr>
         <w:pStyle w:val="ListBullet"/>
+        <w:spacing w:line="360" w:lineRule="auto"/>
       </w:pPr>
       <w:r>
         <w:rPr>
@@ -14482,6 +14586,7 @@
     <w:p>
       <w:pPr>
         <w:pStyle w:val="ListBullet"/>
+        <w:spacing w:line="360" w:lineRule="auto"/>
       </w:pPr>
       <w:r>
         <w:rPr>
@@ -14505,6 +14610,7 @@
     <w:p>
       <w:pPr>
         <w:pStyle w:val="ListBullet"/>
+        <w:spacing w:line="360" w:lineRule="auto"/>
       </w:pPr>
       <w:r>
         <w:rPr>
@@ -14517,6 +14623,7 @@
     <w:p>
       <w:pPr>
         <w:pStyle w:val="ListBullet"/>
+        <w:spacing w:line="360" w:lineRule="auto"/>
       </w:pPr>
       <w:r>
         <w:rPr>
@@ -14529,6 +14636,7 @@
     <w:p>
       <w:pPr>
         <w:pStyle w:val="ListBullet"/>
+        <w:spacing w:line="360" w:lineRule="auto"/>
       </w:pPr>
       <w:r>
         <w:rPr>
@@ -14541,6 +14649,7 @@
     <w:p>
       <w:pPr>
         <w:pStyle w:val="ListBullet"/>
+        <w:spacing w:line="360" w:lineRule="auto"/>
       </w:pPr>
       <w:r>
         <w:rPr>
@@ -14553,6 +14662,7 @@
     <w:p>
       <w:pPr>
         <w:pStyle w:val="ListBullet"/>
+        <w:spacing w:line="360" w:lineRule="auto"/>
       </w:pPr>
       <w:r>
         <w:rPr>
@@ -14565,6 +14675,7 @@
     <w:p>
       <w:pPr>
         <w:pStyle w:val="ListBullet"/>
+        <w:spacing w:line="360" w:lineRule="auto"/>
       </w:pPr>
       <w:r>
         <w:rPr>
@@ -14577,6 +14688,7 @@
     <w:p>
       <w:pPr>
         <w:pStyle w:val="ListBullet"/>
+        <w:spacing w:line="360" w:lineRule="auto"/>
       </w:pPr>
       <w:r>
         <w:rPr>
@@ -14589,6 +14701,7 @@
     <w:p>
       <w:pPr>
         <w:pStyle w:val="ListBullet"/>
+        <w:spacing w:line="360" w:lineRule="auto"/>
       </w:pPr>
       <w:r>
         <w:rPr>
@@ -14601,6 +14714,7 @@
     <w:p>
       <w:pPr>
         <w:pStyle w:val="ListBullet"/>
+        <w:spacing w:line="360" w:lineRule="auto"/>
       </w:pPr>
       <w:r>
         <w:rPr>
@@ -14613,6 +14727,7 @@
     <w:p>
       <w:pPr>
         <w:pStyle w:val="ListBullet"/>
+        <w:spacing w:line="360" w:lineRule="auto"/>
       </w:pPr>
       <w:r>
         <w:rPr>

</xml_diff>

<commit_message>
Typeset display equations as math images; rebuild final document
Render the Chapter 1-3 display equations as LaTeX-quality images
(code/render_equations.py) and embed them at natural size; rebuild
Dissertation_Coquet_FINAL.docx/.pdf (84 numbered pages incl. appendices).
</commit_message>
<xml_diff>
--- a/Dissertation_Coquet_FINAL.docx
+++ b/Dissertation_Coquet_FINAL.docx
@@ -1165,15 +1165,41 @@
     </w:p>
     <w:p>
       <w:pPr>
-        <w:spacing w:line="240" w:lineRule="auto"/>
-        <w:ind w:left="432"/>
-      </w:pPr>
-      <w:r>
-        <w:rPr>
-          <w:rFonts w:ascii="Consolas" w:hAnsi="Consolas" w:eastAsia="Consolas"/>
-          <w:sz w:val="21"/>
-        </w:rPr>
-        <w:t>IS = Σ_t n_t·(S_t − S_0)  +  (N − Σ_t n_t)·(S_end − S_0)  +  Σ_t c_t</w:t>
+        <w:jc w:val="center"/>
+      </w:pPr>
+      <w:r>
+        <w:drawing>
+          <wp:inline xmlns:a="http://schemas.openxmlformats.org/drawingml/2006/main" xmlns:pic="http://schemas.openxmlformats.org/drawingml/2006/picture">
+            <wp:extent cx="4443984" cy="534924"/>
+            <wp:docPr id="1" name="Picture 1"/>
+            <wp:cNvGraphicFramePr>
+              <a:graphicFrameLocks noChangeAspect="1"/>
+            </wp:cNvGraphicFramePr>
+            <a:graphic>
+              <a:graphicData uri="http://schemas.openxmlformats.org/drawingml/2006/picture">
+                <pic:pic>
+                  <pic:nvPicPr>
+                    <pic:cNvPr id="0" name="eq_is_perold.png"/>
+                    <pic:cNvPicPr/>
+                  </pic:nvPicPr>
+                  <pic:blipFill>
+                    <a:blip r:embed="rId9"/>
+                    <a:stretch>
+                      <a:fillRect/>
+                    </a:stretch>
+                  </pic:blipFill>
+                  <pic:spPr>
+                    <a:xfrm>
+                      <a:off x="0" y="0"/>
+                      <a:ext cx="4443984" cy="534924"/>
+                    </a:xfrm>
+                    <a:prstGeom prst="rect"/>
+                  </pic:spPr>
+                </pic:pic>
+              </a:graphicData>
+            </a:graphic>
+          </wp:inline>
+        </w:drawing>
       </w:r>
     </w:p>
     <w:p>
@@ -1196,7 +1222,7 @@
         <w:drawing>
           <wp:inline xmlns:a="http://schemas.openxmlformats.org/drawingml/2006/main" xmlns:pic="http://schemas.openxmlformats.org/drawingml/2006/picture">
             <wp:extent cx="5212080" cy="2669602"/>
-            <wp:docPr id="1" name="Picture 1"/>
+            <wp:docPr id="2" name="Picture 2"/>
             <wp:cNvGraphicFramePr>
               <a:graphicFrameLocks noChangeAspect="1"/>
             </wp:cNvGraphicFramePr>
@@ -1208,7 +1234,7 @@
                     <pic:cNvPicPr/>
                   </pic:nvPicPr>
                   <pic:blipFill>
-                    <a:blip r:embed="rId9"/>
+                    <a:blip r:embed="rId10"/>
                     <a:stretch>
                       <a:fillRect/>
                     </a:stretch>
@@ -1288,15 +1314,41 @@
     </w:p>
     <w:p>
       <w:pPr>
-        <w:spacing w:line="240" w:lineRule="auto"/>
-        <w:ind w:left="432"/>
-      </w:pPr>
-      <w:r>
-        <w:rPr>
-          <w:rFonts w:ascii="Consolas" w:hAnsi="Consolas" w:eastAsia="Consolas"/>
-          <w:sz w:val="21"/>
-        </w:rPr>
-        <w:t>g(v) = η · (v / V)^δ</w:t>
+        <w:jc w:val="center"/>
+      </w:pPr>
+      <w:r>
+        <w:drawing>
+          <wp:inline xmlns:a="http://schemas.openxmlformats.org/drawingml/2006/main" xmlns:pic="http://schemas.openxmlformats.org/drawingml/2006/picture">
+            <wp:extent cx="1298448" cy="347472"/>
+            <wp:docPr id="3" name="Picture 3"/>
+            <wp:cNvGraphicFramePr>
+              <a:graphicFrameLocks noChangeAspect="1"/>
+            </wp:cNvGraphicFramePr>
+            <a:graphic>
+              <a:graphicData uri="http://schemas.openxmlformats.org/drawingml/2006/picture">
+                <pic:pic>
+                  <pic:nvPicPr>
+                    <pic:cNvPr id="0" name="eq_impact_power.png"/>
+                    <pic:cNvPicPr/>
+                  </pic:nvPicPr>
+                  <pic:blipFill>
+                    <a:blip r:embed="rId11"/>
+                    <a:stretch>
+                      <a:fillRect/>
+                    </a:stretch>
+                  </pic:blipFill>
+                  <pic:spPr>
+                    <a:xfrm>
+                      <a:off x="0" y="0"/>
+                      <a:ext cx="1298448" cy="347472"/>
+                    </a:xfrm>
+                    <a:prstGeom prst="rect"/>
+                  </pic:spPr>
+                </pic:pic>
+              </a:graphicData>
+            </a:graphic>
+          </wp:inline>
+        </w:drawing>
       </w:r>
     </w:p>
     <w:p>
@@ -1442,15 +1494,41 @@
     </w:p>
     <w:p>
       <w:pPr>
-        <w:spacing w:line="240" w:lineRule="auto"/>
-        <w:ind w:left="432"/>
-      </w:pPr>
-      <w:r>
-        <w:rPr>
-          <w:rFonts w:ascii="Consolas" w:hAnsi="Consolas" w:eastAsia="Consolas"/>
-          <w:sz w:val="21"/>
-        </w:rPr>
-        <w:t>S̃_k = S_{k−1} + σ·√τ·ξ_k  −  κ·n_k  −  η·(n_k / τ)</w:t>
+        <w:jc w:val="center"/>
+      </w:pPr>
+      <w:r>
+        <w:drawing>
+          <wp:inline xmlns:a="http://schemas.openxmlformats.org/drawingml/2006/main" xmlns:pic="http://schemas.openxmlformats.org/drawingml/2006/picture">
+            <wp:extent cx="3108960" cy="356616"/>
+            <wp:docPr id="4" name="Picture 4"/>
+            <wp:cNvGraphicFramePr>
+              <a:graphicFrameLocks noChangeAspect="1"/>
+            </wp:cNvGraphicFramePr>
+            <a:graphic>
+              <a:graphicData uri="http://schemas.openxmlformats.org/drawingml/2006/picture">
+                <pic:pic>
+                  <pic:nvPicPr>
+                    <pic:cNvPr id="0" name="eq_ac_dynamics.png"/>
+                    <pic:cNvPicPr/>
+                  </pic:nvPicPr>
+                  <pic:blipFill>
+                    <a:blip r:embed="rId12"/>
+                    <a:stretch>
+                      <a:fillRect/>
+                    </a:stretch>
+                  </pic:blipFill>
+                  <pic:spPr>
+                    <a:xfrm>
+                      <a:off x="0" y="0"/>
+                      <a:ext cx="3108960" cy="356616"/>
+                    </a:xfrm>
+                    <a:prstGeom prst="rect"/>
+                  </pic:spPr>
+                </pic:pic>
+              </a:graphicData>
+            </a:graphic>
+          </wp:inline>
+        </w:drawing>
       </w:r>
     </w:p>
     <w:p>
@@ -1467,15 +1545,41 @@
     </w:p>
     <w:p>
       <w:pPr>
-        <w:spacing w:line="240" w:lineRule="auto"/>
-        <w:ind w:left="432"/>
-      </w:pPr>
-      <w:r>
-        <w:rPr>
-          <w:rFonts w:ascii="Consolas" w:hAnsi="Consolas" w:eastAsia="Consolas"/>
-          <w:sz w:val="21"/>
-        </w:rPr>
-        <w:t>x_k = X_0 · sinh(κ̃·(T − t_k)) / sinh(κ̃·T)</w:t>
+        <w:jc w:val="center"/>
+      </w:pPr>
+      <w:r>
+        <w:drawing>
+          <wp:inline xmlns:a="http://schemas.openxmlformats.org/drawingml/2006/main" xmlns:pic="http://schemas.openxmlformats.org/drawingml/2006/picture">
+            <wp:extent cx="1677924" cy="452628"/>
+            <wp:docPr id="5" name="Picture 5"/>
+            <wp:cNvGraphicFramePr>
+              <a:graphicFrameLocks noChangeAspect="1"/>
+            </wp:cNvGraphicFramePr>
+            <a:graphic>
+              <a:graphicData uri="http://schemas.openxmlformats.org/drawingml/2006/picture">
+                <pic:pic>
+                  <pic:nvPicPr>
+                    <pic:cNvPr id="0" name="eq_ac_traj.png"/>
+                    <pic:cNvPicPr/>
+                  </pic:nvPicPr>
+                  <pic:blipFill>
+                    <a:blip r:embed="rId13"/>
+                    <a:stretch>
+                      <a:fillRect/>
+                    </a:stretch>
+                  </pic:blipFill>
+                  <pic:spPr>
+                    <a:xfrm>
+                      <a:off x="0" y="0"/>
+                      <a:ext cx="1677924" cy="452628"/>
+                    </a:xfrm>
+                    <a:prstGeom prst="rect"/>
+                  </pic:spPr>
+                </pic:pic>
+              </a:graphicData>
+            </a:graphic>
+          </wp:inline>
+        </w:drawing>
       </w:r>
     </w:p>
     <w:p>
@@ -1486,7 +1590,7 @@
         <w:drawing>
           <wp:inline xmlns:a="http://schemas.openxmlformats.org/drawingml/2006/main" xmlns:pic="http://schemas.openxmlformats.org/drawingml/2006/picture">
             <wp:extent cx="5212080" cy="3017520"/>
-            <wp:docPr id="2" name="Picture 2"/>
+            <wp:docPr id="6" name="Picture 6"/>
             <wp:cNvGraphicFramePr>
               <a:graphicFrameLocks noChangeAspect="1"/>
             </wp:cNvGraphicFramePr>
@@ -1498,7 +1602,7 @@
                     <pic:cNvPicPr/>
                   </pic:nvPicPr>
                   <pic:blipFill>
-                    <a:blip r:embed="rId10"/>
+                    <a:blip r:embed="rId14"/>
                     <a:stretch>
                       <a:fillRect/>
                     </a:stretch>
@@ -1737,7 +1841,7 @@
         <w:drawing>
           <wp:inline xmlns:a="http://schemas.openxmlformats.org/drawingml/2006/main" xmlns:pic="http://schemas.openxmlformats.org/drawingml/2006/picture">
             <wp:extent cx="5212080" cy="2806505"/>
-            <wp:docPr id="3" name="Picture 3"/>
+            <wp:docPr id="7" name="Picture 7"/>
             <wp:cNvGraphicFramePr>
               <a:graphicFrameLocks noChangeAspect="1"/>
             </wp:cNvGraphicFramePr>
@@ -1749,7 +1853,7 @@
                     <pic:cNvPicPr/>
                   </pic:nvPicPr>
                   <pic:blipFill>
-                    <a:blip r:embed="rId11"/>
+                    <a:blip r:embed="rId15"/>
                     <a:stretch>
                       <a:fillRect/>
                     </a:stretch>
@@ -1946,15 +2050,41 @@
     </w:p>
     <w:p>
       <w:pPr>
-        <w:spacing w:line="240" w:lineRule="auto"/>
-        <w:ind w:left="432"/>
-      </w:pPr>
-      <w:r>
-        <w:rPr>
-          <w:rFonts w:ascii="Consolas" w:hAnsi="Consolas" w:eastAsia="Consolas"/>
-          <w:sz w:val="21"/>
-        </w:rPr>
-        <w:t>π* = arg max_π  E_π [ Σ_{t=0}^{T} γ^t · R(s_t, a_t) ]</w:t>
+        <w:jc w:val="center"/>
+      </w:pPr>
+      <w:r>
+        <w:drawing>
+          <wp:inline xmlns:a="http://schemas.openxmlformats.org/drawingml/2006/main" xmlns:pic="http://schemas.openxmlformats.org/drawingml/2006/picture">
+            <wp:extent cx="2761488" cy="676656"/>
+            <wp:docPr id="8" name="Picture 8"/>
+            <wp:cNvGraphicFramePr>
+              <a:graphicFrameLocks noChangeAspect="1"/>
+            </wp:cNvGraphicFramePr>
+            <a:graphic>
+              <a:graphicData uri="http://schemas.openxmlformats.org/drawingml/2006/picture">
+                <pic:pic>
+                  <pic:nvPicPr>
+                    <pic:cNvPr id="0" name="eq_opt_policy.png"/>
+                    <pic:cNvPicPr/>
+                  </pic:nvPicPr>
+                  <pic:blipFill>
+                    <a:blip r:embed="rId16"/>
+                    <a:stretch>
+                      <a:fillRect/>
+                    </a:stretch>
+                  </pic:blipFill>
+                  <pic:spPr>
+                    <a:xfrm>
+                      <a:off x="0" y="0"/>
+                      <a:ext cx="2761488" cy="676656"/>
+                    </a:xfrm>
+                    <a:prstGeom prst="rect"/>
+                  </pic:spPr>
+                </pic:pic>
+              </a:graphicData>
+            </a:graphic>
+          </wp:inline>
+        </w:drawing>
       </w:r>
     </w:p>
     <w:p>
@@ -1994,15 +2124,41 @@
     </w:p>
     <w:p>
       <w:pPr>
-        <w:spacing w:line="240" w:lineRule="auto"/>
-        <w:ind w:left="432"/>
-      </w:pPr>
-      <w:r>
-        <w:rPr>
-          <w:rFonts w:ascii="Consolas" w:hAnsi="Consolas" w:eastAsia="Consolas"/>
-          <w:sz w:val="21"/>
-        </w:rPr>
-        <w:t>L(θ) = E[ ( r_t + γ·max_{a'} Q(s_{t+1}, a'; θ⁻) − Q(s_t, a_t; θ) )² ]</w:t>
+        <w:jc w:val="center"/>
+      </w:pPr>
+      <w:r>
+        <w:drawing>
+          <wp:inline xmlns:a="http://schemas.openxmlformats.org/drawingml/2006/main" xmlns:pic="http://schemas.openxmlformats.org/drawingml/2006/picture">
+            <wp:extent cx="4315968" cy="434340"/>
+            <wp:docPr id="9" name="Picture 9"/>
+            <wp:cNvGraphicFramePr>
+              <a:graphicFrameLocks noChangeAspect="1"/>
+            </wp:cNvGraphicFramePr>
+            <a:graphic>
+              <a:graphicData uri="http://schemas.openxmlformats.org/drawingml/2006/picture">
+                <pic:pic>
+                  <pic:nvPicPr>
+                    <pic:cNvPr id="0" name="eq_dqn_loss.png"/>
+                    <pic:cNvPicPr/>
+                  </pic:nvPicPr>
+                  <pic:blipFill>
+                    <a:blip r:embed="rId17"/>
+                    <a:stretch>
+                      <a:fillRect/>
+                    </a:stretch>
+                  </pic:blipFill>
+                  <pic:spPr>
+                    <a:xfrm>
+                      <a:off x="0" y="0"/>
+                      <a:ext cx="4315968" cy="434340"/>
+                    </a:xfrm>
+                    <a:prstGeom prst="rect"/>
+                  </pic:spPr>
+                </pic:pic>
+              </a:graphicData>
+            </a:graphic>
+          </wp:inline>
+        </w:drawing>
       </w:r>
     </w:p>
     <w:p>
@@ -2031,15 +2187,41 @@
     </w:p>
     <w:p>
       <w:pPr>
-        <w:spacing w:line="240" w:lineRule="auto"/>
-        <w:ind w:left="432"/>
-      </w:pPr>
-      <w:r>
-        <w:rPr>
-          <w:rFonts w:ascii="Consolas" w:hAnsi="Consolas" w:eastAsia="Consolas"/>
-          <w:sz w:val="21"/>
-        </w:rPr>
-        <w:t>L^CLIP(θ) = E_t [ min( ρ_t(θ)·Â_t,  clip(ρ_t(θ), 1−ε, 1+ε)·Â_t ) ]</w:t>
+        <w:jc w:val="center"/>
+      </w:pPr>
+      <w:r>
+        <w:drawing>
+          <wp:inline xmlns:a="http://schemas.openxmlformats.org/drawingml/2006/main" xmlns:pic="http://schemas.openxmlformats.org/drawingml/2006/picture">
+            <wp:extent cx="4594860" cy="374904"/>
+            <wp:docPr id="10" name="Picture 10"/>
+            <wp:cNvGraphicFramePr>
+              <a:graphicFrameLocks noChangeAspect="1"/>
+            </wp:cNvGraphicFramePr>
+            <a:graphic>
+              <a:graphicData uri="http://schemas.openxmlformats.org/drawingml/2006/picture">
+                <pic:pic>
+                  <pic:nvPicPr>
+                    <pic:cNvPr id="0" name="eq_ppo_clip.png"/>
+                    <pic:cNvPicPr/>
+                  </pic:nvPicPr>
+                  <pic:blipFill>
+                    <a:blip r:embed="rId18"/>
+                    <a:stretch>
+                      <a:fillRect/>
+                    </a:stretch>
+                  </pic:blipFill>
+                  <pic:spPr>
+                    <a:xfrm>
+                      <a:off x="0" y="0"/>
+                      <a:ext cx="4594860" cy="374904"/>
+                    </a:xfrm>
+                    <a:prstGeom prst="rect"/>
+                  </pic:spPr>
+                </pic:pic>
+              </a:graphicData>
+            </a:graphic>
+          </wp:inline>
+        </w:drawing>
       </w:r>
     </w:p>
     <w:p>
@@ -2062,7 +2244,7 @@
         <w:drawing>
           <wp:inline xmlns:a="http://schemas.openxmlformats.org/drawingml/2006/main" xmlns:pic="http://schemas.openxmlformats.org/drawingml/2006/picture">
             <wp:extent cx="5212080" cy="2606040"/>
-            <wp:docPr id="4" name="Picture 4"/>
+            <wp:docPr id="11" name="Picture 11"/>
             <wp:cNvGraphicFramePr>
               <a:graphicFrameLocks noChangeAspect="1"/>
             </wp:cNvGraphicFramePr>
@@ -2074,7 +2256,7 @@
                     <pic:cNvPicPr/>
                   </pic:nvPicPr>
                   <pic:blipFill>
-                    <a:blip r:embed="rId12"/>
+                    <a:blip r:embed="rId19"/>
                     <a:stretch>
                       <a:fillRect/>
                     </a:stretch>
@@ -2493,7 +2675,7 @@
         <w:drawing>
           <wp:inline xmlns:a="http://schemas.openxmlformats.org/drawingml/2006/main" xmlns:pic="http://schemas.openxmlformats.org/drawingml/2006/picture">
             <wp:extent cx="5212080" cy="2481943"/>
-            <wp:docPr id="5" name="Picture 5"/>
+            <wp:docPr id="12" name="Picture 12"/>
             <wp:cNvGraphicFramePr>
               <a:graphicFrameLocks noChangeAspect="1"/>
             </wp:cNvGraphicFramePr>
@@ -2505,7 +2687,7 @@
                     <pic:cNvPicPr/>
                   </pic:nvPicPr>
                   <pic:blipFill>
-                    <a:blip r:embed="rId13"/>
+                    <a:blip r:embed="rId20"/>
                     <a:stretch>
                       <a:fillRect/>
                     </a:stretch>
@@ -2568,14 +2750,41 @@
     </w:p>
     <w:p>
       <w:pPr>
-        <w:jc w:val="both"/>
-      </w:pPr>
-      <w:r>
-        <w:rPr>
-          <w:b w:val="0"/>
-          <w:i w:val="0"/>
-        </w:rPr>
-        <w:t>s_t = (q_t, τ_t, S_t/S_0, σ̂_t, OFI_t, L_t^1, ..., L_t^n, ΔS_t^{ij})</w:t>
+        <w:jc w:val="center"/>
+      </w:pPr>
+      <w:r>
+        <w:drawing>
+          <wp:inline xmlns:a="http://schemas.openxmlformats.org/drawingml/2006/main" xmlns:pic="http://schemas.openxmlformats.org/drawingml/2006/picture">
+            <wp:extent cx="4137660" cy="361188"/>
+            <wp:docPr id="13" name="Picture 13"/>
+            <wp:cNvGraphicFramePr>
+              <a:graphicFrameLocks noChangeAspect="1"/>
+            </wp:cNvGraphicFramePr>
+            <a:graphic>
+              <a:graphicData uri="http://schemas.openxmlformats.org/drawingml/2006/picture">
+                <pic:pic>
+                  <pic:nvPicPr>
+                    <pic:cNvPr id="0" name="eq_state2.png"/>
+                    <pic:cNvPicPr/>
+                  </pic:nvPicPr>
+                  <pic:blipFill>
+                    <a:blip r:embed="rId21"/>
+                    <a:stretch>
+                      <a:fillRect/>
+                    </a:stretch>
+                  </pic:blipFill>
+                  <pic:spPr>
+                    <a:xfrm>
+                      <a:off x="0" y="0"/>
+                      <a:ext cx="4137660" cy="361188"/>
+                    </a:xfrm>
+                    <a:prstGeom prst="rect"/>
+                  </pic:spPr>
+                </pic:pic>
+              </a:graphicData>
+            </a:graphic>
+          </wp:inline>
+        </w:drawing>
       </w:r>
     </w:p>
     <w:p>
@@ -2770,6 +2979,45 @@
     </w:p>
     <w:p>
       <w:pPr>
+        <w:jc w:val="center"/>
+      </w:pPr>
+      <w:r>
+        <w:drawing>
+          <wp:inline xmlns:a="http://schemas.openxmlformats.org/drawingml/2006/main" xmlns:pic="http://schemas.openxmlformats.org/drawingml/2006/picture">
+            <wp:extent cx="4645152" cy="548640"/>
+            <wp:docPr id="14" name="Picture 14"/>
+            <wp:cNvGraphicFramePr>
+              <a:graphicFrameLocks noChangeAspect="1"/>
+            </wp:cNvGraphicFramePr>
+            <a:graphic>
+              <a:graphicData uri="http://schemas.openxmlformats.org/drawingml/2006/picture">
+                <pic:pic>
+                  <pic:nvPicPr>
+                    <pic:cNvPr id="0" name="eq_trans2.png"/>
+                    <pic:cNvPicPr/>
+                  </pic:nvPicPr>
+                  <pic:blipFill>
+                    <a:blip r:embed="rId22"/>
+                    <a:stretch>
+                      <a:fillRect/>
+                    </a:stretch>
+                  </pic:blipFill>
+                  <pic:spPr>
+                    <a:xfrm>
+                      <a:off x="0" y="0"/>
+                      <a:ext cx="4645152" cy="548640"/>
+                    </a:xfrm>
+                    <a:prstGeom prst="rect"/>
+                  </pic:spPr>
+                </pic:pic>
+              </a:graphicData>
+            </a:graphic>
+          </wp:inline>
+        </w:drawing>
+      </w:r>
+    </w:p>
+    <w:p>
+      <w:pPr>
         <w:jc w:val="both"/>
       </w:pPr>
       <w:r>
@@ -2777,7 +3025,7 @@
           <w:b w:val="0"/>
           <w:i w:val="0"/>
         </w:rPr>
-        <w:t>S_{t+1} = S_t + η · (Σ_k v_t^k) · S_0 + μ(OFI_t) · Δt + σ̂_t · S_t · √Δt · ε_{t+1}</w:t>
+        <w:t>where η is the permanent impact coefficient (Kyle, 1985; Almgren et al., 2005), μ(OFI_t) is a drift function of the order flow imbalance (capturing short-term price predictability), Δt is the length of one time step, and ε_{t+1} ~ N(0, 1) is the idiosyncratic price shock. Available liquidity at each venue evolves according to a mean-reverting process with stochastic shocks that are correlated across venues, reflecting the empirical finding of liquidity co-migration documented by Gresse (2017) and Menkveld (2013).</w:t>
       </w:r>
     </w:p>
     <w:p>
@@ -2786,10 +3034,56 @@
       </w:pPr>
       <w:r>
         <w:rPr>
-          <w:b w:val="0"/>
-          <w:i w:val="0"/>
-        </w:rPr>
-        <w:t>where η is the permanent impact coefficient (Kyle, 1985; Almgren et al., 2005), μ(OFI_t) is a drift function of the order flow imbalance (capturing short-term price predictability), Δt is the length of one time step, and ε_{t+1} ~ N(0, 1) is the idiosyncratic price shock. Available liquidity at each venue evolves according to a mean-reverting process with stochastic shocks that are correlated across venues, reflecting the empirical finding of liquidity co-migration documented by Gresse (2017) and Menkveld (2013).</w:t>
+          <w:b/>
+          <w:i w:val="0"/>
+        </w:rPr>
+        <w:t>Reward function.</w:t>
+      </w:r>
+      <w:r>
+        <w:rPr>
+          <w:b w:val="0"/>
+          <w:i w:val="0"/>
+        </w:rPr>
+        <w:t xml:space="preserve"> The immediate reward at step t combines execution revenue net of all price costs:</w:t>
+      </w:r>
+    </w:p>
+    <w:p>
+      <w:pPr>
+        <w:jc w:val="center"/>
+      </w:pPr>
+      <w:r>
+        <w:drawing>
+          <wp:inline xmlns:a="http://schemas.openxmlformats.org/drawingml/2006/main" xmlns:pic="http://schemas.openxmlformats.org/drawingml/2006/picture">
+            <wp:extent cx="4480560" cy="534924"/>
+            <wp:docPr id="15" name="Picture 15"/>
+            <wp:cNvGraphicFramePr>
+              <a:graphicFrameLocks noChangeAspect="1"/>
+            </wp:cNvGraphicFramePr>
+            <a:graphic>
+              <a:graphicData uri="http://schemas.openxmlformats.org/drawingml/2006/picture">
+                <pic:pic>
+                  <pic:nvPicPr>
+                    <pic:cNvPr id="0" name="eq_reward2.png"/>
+                    <pic:cNvPicPr/>
+                  </pic:nvPicPr>
+                  <pic:blipFill>
+                    <a:blip r:embed="rId23"/>
+                    <a:stretch>
+                      <a:fillRect/>
+                    </a:stretch>
+                  </pic:blipFill>
+                  <pic:spPr>
+                    <a:xfrm>
+                      <a:off x="0" y="0"/>
+                      <a:ext cx="4480560" cy="534924"/>
+                    </a:xfrm>
+                    <a:prstGeom prst="rect"/>
+                  </pic:spPr>
+                </pic:pic>
+              </a:graphicData>
+            </a:graphic>
+          </wp:inline>
+        </w:drawing>
       </w:r>
     </w:p>
     <w:p>
@@ -2798,17 +3092,68 @@
       </w:pPr>
       <w:r>
         <w:rPr>
+          <w:b w:val="0"/>
+          <w:i w:val="0"/>
+        </w:rPr>
+        <w:t>The three terms represent, respectively: the quadratic temporary impact cost (with coefficient κ measuring the venue-average instantaneous impact), the price drift cost relative to the arrival price S_0 (capturing the opportunity cost of adverse price movement during execution), and an adaptive inventory risk penalty (with coefficient λ weighting the urgency-adjusted variance of holding residual inventory). A terminal penalty r_T = −Φ · q_T^2 is applied at horizon T, penalising any residual inventory q_T &gt; 0 and ensuring the agent has a strong incentive to complete the order.</w:t>
+      </w:r>
+    </w:p>
+    <w:p>
+      <w:pPr>
+        <w:jc w:val="both"/>
+      </w:pPr>
+      <w:r>
+        <w:rPr>
           <w:b/>
           <w:i w:val="0"/>
         </w:rPr>
-        <w:t>Reward function.</w:t>
-      </w:r>
-      <w:r>
-        <w:rPr>
-          <w:b w:val="0"/>
-          <w:i w:val="0"/>
-        </w:rPr>
-        <w:t xml:space="preserve"> The immediate reward at step t combines execution revenue net of all price costs:</w:t>
+        <w:t>Objective and Bellman equation.</w:t>
+      </w:r>
+      <w:r>
+        <w:rPr>
+          <w:b w:val="0"/>
+          <w:i w:val="0"/>
+        </w:rPr>
+        <w:t xml:space="preserve"> The agent seeks a policy π : S → A that maximises the expected cumulative reward:</w:t>
+      </w:r>
+    </w:p>
+    <w:p>
+      <w:pPr>
+        <w:jc w:val="center"/>
+      </w:pPr>
+      <w:r>
+        <w:drawing>
+          <wp:inline xmlns:a="http://schemas.openxmlformats.org/drawingml/2006/main" xmlns:pic="http://schemas.openxmlformats.org/drawingml/2006/picture">
+            <wp:extent cx="1453896" cy="676656"/>
+            <wp:docPr id="16" name="Picture 16"/>
+            <wp:cNvGraphicFramePr>
+              <a:graphicFrameLocks noChangeAspect="1"/>
+            </wp:cNvGraphicFramePr>
+            <a:graphic>
+              <a:graphicData uri="http://schemas.openxmlformats.org/drawingml/2006/picture">
+                <pic:pic>
+                  <pic:nvPicPr>
+                    <pic:cNvPr id="0" name="eq_obj2.png"/>
+                    <pic:cNvPicPr/>
+                  </pic:nvPicPr>
+                  <pic:blipFill>
+                    <a:blip r:embed="rId24"/>
+                    <a:stretch>
+                      <a:fillRect/>
+                    </a:stretch>
+                  </pic:blipFill>
+                  <pic:spPr>
+                    <a:xfrm>
+                      <a:off x="0" y="0"/>
+                      <a:ext cx="1453896" cy="676656"/>
+                    </a:xfrm>
+                    <a:prstGeom prst="rect"/>
+                  </pic:spPr>
+                </pic:pic>
+              </a:graphicData>
+            </a:graphic>
+          </wp:inline>
+        </w:drawing>
       </w:r>
     </w:p>
     <w:p>
@@ -2820,7 +3165,46 @@
           <w:b w:val="0"/>
           <w:i w:val="0"/>
         </w:rPr>
-        <w:t>r_t = −[ κ · (Σ_k v_t^k)^2 · Δt + (S_t − S_0) · (Σ_k v_t^k) · Q_0 + λ · q_t^2 · σ̂_t^2 ]</w:t>
+        <w:t>The optimal value function V*(s) = max_π J(π | s_0 = s) satisfies the Bellman optimality equation:</w:t>
+      </w:r>
+    </w:p>
+    <w:p>
+      <w:pPr>
+        <w:jc w:val="center"/>
+      </w:pPr>
+      <w:r>
+        <w:drawing>
+          <wp:inline xmlns:a="http://schemas.openxmlformats.org/drawingml/2006/main" xmlns:pic="http://schemas.openxmlformats.org/drawingml/2006/picture">
+            <wp:extent cx="3698748" cy="434340"/>
+            <wp:docPr id="17" name="Picture 17"/>
+            <wp:cNvGraphicFramePr>
+              <a:graphicFrameLocks noChangeAspect="1"/>
+            </wp:cNvGraphicFramePr>
+            <a:graphic>
+              <a:graphicData uri="http://schemas.openxmlformats.org/drawingml/2006/picture">
+                <pic:pic>
+                  <pic:nvPicPr>
+                    <pic:cNvPr id="0" name="eq_bellman2.png"/>
+                    <pic:cNvPicPr/>
+                  </pic:nvPicPr>
+                  <pic:blipFill>
+                    <a:blip r:embed="rId25"/>
+                    <a:stretch>
+                      <a:fillRect/>
+                    </a:stretch>
+                  </pic:blipFill>
+                  <pic:spPr>
+                    <a:xfrm>
+                      <a:off x="0" y="0"/>
+                      <a:ext cx="3698748" cy="434340"/>
+                    </a:xfrm>
+                    <a:prstGeom prst="rect"/>
+                  </pic:spPr>
+                </pic:pic>
+              </a:graphicData>
+            </a:graphic>
+          </wp:inline>
+        </w:drawing>
       </w:r>
     </w:p>
     <w:p>
@@ -2832,7 +3216,7 @@
           <w:b w:val="0"/>
           <w:i w:val="0"/>
         </w:rPr>
-        <w:t>The three terms represent, respectively: the quadratic temporary impact cost (with coefficient κ measuring the venue-average instantaneous impact), the price drift cost relative to the arrival price S_0 (capturing the opportunity cost of adverse price movement during execution), and an adaptive inventory risk penalty (with coefficient λ weighting the urgency-adjusted variance of holding residual inventory). A terminal penalty r_T = −Φ · q_T^2 is applied at horizon T, penalising any residual inventory q_T &gt; 0 and ensuring the agent has a strong incentive to complete the order.</w:t>
+        <w:t>Because S is continuous and high-dimensional, the exact Bellman equation cannot be solved by dynamic programming on a discretised grid. This motivates the use of function approximation. In the empirical study, it is approximated by compact linear policies of the DQN-family and PPO-family described in Section 2.1.3, optimised by the gradient-free Cross-Entropy Method; deep neural-network function approximation is the natural scalable extension and is not implemented here.</w:t>
       </w:r>
     </w:p>
     <w:p>
@@ -2841,17 +3225,142 @@
       </w:pPr>
       <w:r>
         <w:rPr>
+          <w:b w:val="0"/>
+          <w:i w:val="0"/>
+        </w:rPr>
+        <w:t>The Implementation Shortfall incurred by a given execution trajectory (n_1, ..., n_T), where n_t = Σ_k v_t^k · Q_0 shares are executed at step t at an average fill price P_t, is:</w:t>
+      </w:r>
+    </w:p>
+    <w:p>
+      <w:pPr>
+        <w:jc w:val="center"/>
+      </w:pPr>
+      <w:r>
+        <w:drawing>
+          <wp:inline xmlns:a="http://schemas.openxmlformats.org/drawingml/2006/main" xmlns:pic="http://schemas.openxmlformats.org/drawingml/2006/picture">
+            <wp:extent cx="3781044" cy="534924"/>
+            <wp:docPr id="18" name="Picture 18"/>
+            <wp:cNvGraphicFramePr>
+              <a:graphicFrameLocks noChangeAspect="1"/>
+            </wp:cNvGraphicFramePr>
+            <a:graphic>
+              <a:graphicData uri="http://schemas.openxmlformats.org/drawingml/2006/picture">
+                <pic:pic>
+                  <pic:nvPicPr>
+                    <pic:cNvPr id="0" name="eq_is2.png"/>
+                    <pic:cNvPicPr/>
+                  </pic:nvPicPr>
+                  <pic:blipFill>
+                    <a:blip r:embed="rId26"/>
+                    <a:stretch>
+                      <a:fillRect/>
+                    </a:stretch>
+                  </pic:blipFill>
+                  <pic:spPr>
+                    <a:xfrm>
+                      <a:off x="0" y="0"/>
+                      <a:ext cx="3781044" cy="534924"/>
+                    </a:xfrm>
+                    <a:prstGeom prst="rect"/>
+                  </pic:spPr>
+                </pic:pic>
+              </a:graphicData>
+            </a:graphic>
+          </wp:inline>
+        </w:drawing>
+      </w:r>
+    </w:p>
+    <w:p>
+      <w:pPr>
+        <w:jc w:val="both"/>
+      </w:pPr>
+      <w:r>
+        <w:rPr>
+          <w:b w:val="0"/>
+          <w:i w:val="0"/>
+        </w:rPr>
+        <w:t>Minimising IS is equivalent to maximising J(π) under the correspondence between the price cost terms and the reward function above, providing a direct link between the MDP objective and the empirical performance metric used in Chapter 4.</w:t>
+      </w:r>
+    </w:p>
+    <w:p>
+      <w:pPr>
+        <w:pStyle w:val="Heading3"/>
+      </w:pPr>
+      <w:r>
+        <w:rPr>
+          <w:color w:val="000000"/>
+        </w:rPr>
+        <w:t>2.1.3 Value-Based and Policy-Gradient Learning Approaches</w:t>
+      </w:r>
+    </w:p>
+    <w:p>
+      <w:pPr>
+        <w:jc w:val="both"/>
+      </w:pPr>
+      <w:r>
+        <w:rPr>
+          <w:b w:val="0"/>
+          <w:i w:val="0"/>
+        </w:rPr>
+        <w:t>Two families of reinforcement-learning algorithms frame the two agents, motivated by different treatments of the action space. In the empirical study (Section 3.3.2), each family is instantiated as a compact linear policy optimised by the Cross-Entropy Method; the deep-network forms set out below define the family each agent belongs to and are the scalable extension, not the form run here.</w:t>
+      </w:r>
+    </w:p>
+    <w:p>
+      <w:pPr>
+        <w:jc w:val="both"/>
+      </w:pPr>
+      <w:r>
+        <w:rPr>
           <w:b/>
           <w:i w:val="0"/>
         </w:rPr>
-        <w:t>Objective and Bellman equation.</w:t>
-      </w:r>
-      <w:r>
-        <w:rPr>
-          <w:b w:val="0"/>
-          <w:i w:val="0"/>
-        </w:rPr>
-        <w:t xml:space="preserve"> The agent seeks a policy π : S → A that maximises the expected cumulative reward:</w:t>
+        <w:t>Value-based learning: DQN.</w:t>
+      </w:r>
+      <w:r>
+        <w:rPr>
+          <w:b w:val="0"/>
+          <w:i w:val="0"/>
+        </w:rPr>
+        <w:t xml:space="preserve"> Deep Q-Network learning (Sutton &amp; Barto, 2018) estimates the action-value function Q(s, a), the expected cumulative reward from taking action a in state s and following the optimal policy thereafter. The Q-learning target for a transition (s_t, a_t, r_t, s_{t+1}) is:</w:t>
+      </w:r>
+    </w:p>
+    <w:p>
+      <w:pPr>
+        <w:jc w:val="center"/>
+      </w:pPr>
+      <w:r>
+        <w:drawing>
+          <wp:inline xmlns:a="http://schemas.openxmlformats.org/drawingml/2006/main" xmlns:pic="http://schemas.openxmlformats.org/drawingml/2006/picture">
+            <wp:extent cx="2267712" cy="416052"/>
+            <wp:docPr id="19" name="Picture 19"/>
+            <wp:cNvGraphicFramePr>
+              <a:graphicFrameLocks noChangeAspect="1"/>
+            </wp:cNvGraphicFramePr>
+            <a:graphic>
+              <a:graphicData uri="http://schemas.openxmlformats.org/drawingml/2006/picture">
+                <pic:pic>
+                  <pic:nvPicPr>
+                    <pic:cNvPr id="0" name="eq_dqn_target2.png"/>
+                    <pic:cNvPicPr/>
+                  </pic:nvPicPr>
+                  <pic:blipFill>
+                    <a:blip r:embed="rId27"/>
+                    <a:stretch>
+                      <a:fillRect/>
+                    </a:stretch>
+                  </pic:blipFill>
+                  <pic:spPr>
+                    <a:xfrm>
+                      <a:off x="0" y="0"/>
+                      <a:ext cx="2267712" cy="416052"/>
+                    </a:xfrm>
+                    <a:prstGeom prst="rect"/>
+                  </pic:spPr>
+                </pic:pic>
+              </a:graphicData>
+            </a:graphic>
+          </wp:inline>
+        </w:drawing>
       </w:r>
     </w:p>
     <w:p>
@@ -2863,7 +3372,46 @@
           <w:b w:val="0"/>
           <w:i w:val="0"/>
         </w:rPr>
-        <w:t>J(π) = E_π [ Σ_{t=0}^{T} r_t ]</w:t>
+        <w:t>where θ̄ denotes the parameters of a periodically frozen target network. The network Q_θ is trained by minimising the mean squared Bellman error:</w:t>
+      </w:r>
+    </w:p>
+    <w:p>
+      <w:pPr>
+        <w:jc w:val="center"/>
+      </w:pPr>
+      <w:r>
+        <w:drawing>
+          <wp:inline xmlns:a="http://schemas.openxmlformats.org/drawingml/2006/main" xmlns:pic="http://schemas.openxmlformats.org/drawingml/2006/picture">
+            <wp:extent cx="2281428" cy="342900"/>
+            <wp:docPr id="20" name="Picture 20"/>
+            <wp:cNvGraphicFramePr>
+              <a:graphicFrameLocks noChangeAspect="1"/>
+            </wp:cNvGraphicFramePr>
+            <a:graphic>
+              <a:graphicData uri="http://schemas.openxmlformats.org/drawingml/2006/picture">
+                <pic:pic>
+                  <pic:nvPicPr>
+                    <pic:cNvPr id="0" name="eq_dqn_mse2.png"/>
+                    <pic:cNvPicPr/>
+                  </pic:nvPicPr>
+                  <pic:blipFill>
+                    <a:blip r:embed="rId28"/>
+                    <a:stretch>
+                      <a:fillRect/>
+                    </a:stretch>
+                  </pic:blipFill>
+                  <pic:spPr>
+                    <a:xfrm>
+                      <a:off x="0" y="0"/>
+                      <a:ext cx="2281428" cy="342900"/>
+                    </a:xfrm>
+                    <a:prstGeom prst="rect"/>
+                  </pic:spPr>
+                </pic:pic>
+              </a:graphicData>
+            </a:graphic>
+          </wp:inline>
+        </w:drawing>
       </w:r>
     </w:p>
     <w:p>
@@ -2875,7 +3423,7 @@
           <w:b w:val="0"/>
           <w:i w:val="0"/>
         </w:rPr>
-        <w:t>The optimal value function V*(s) = max_π J(π | s_0 = s) satisfies the Bellman optimality equation:</w:t>
+        <w:t>DQN requires a discrete action space, so the continuous per-venue rate vector is quantised into a finite grid of execution levels. This discretisation is implementationally simple but introduces approximation error, particularly for fine-grained allocation decisions across multiple venues. This limitation motivates hypothesis H1a.</w:t>
       </w:r>
     </w:p>
     <w:p>
@@ -2884,159 +3432,9 @@
       </w:pPr>
       <w:r>
         <w:rPr>
-          <w:b w:val="0"/>
-          <w:i w:val="0"/>
-        </w:rPr>
-        <w:t>V*(s_t) = max_{a_t ∈ A} { r(s_t, a_t) + E[ V*(s_{t+1}) | s_t, a_t ] }</w:t>
-      </w:r>
-    </w:p>
-    <w:p>
-      <w:pPr>
-        <w:jc w:val="both"/>
-      </w:pPr>
-      <w:r>
-        <w:rPr>
-          <w:b w:val="0"/>
-          <w:i w:val="0"/>
-        </w:rPr>
-        <w:t>Because S is continuous and high-dimensional, the exact Bellman equation cannot be solved by dynamic programming on a discretised grid. This motivates the use of function approximation. In the empirical study, it is approximated by compact linear policies of the DQN-family and PPO-family described in Section 2.1.3, optimised by the gradient-free Cross-Entropy Method; deep neural-network function approximation is the natural scalable extension and is not implemented here.</w:t>
-      </w:r>
-    </w:p>
-    <w:p>
-      <w:pPr>
-        <w:jc w:val="both"/>
-      </w:pPr>
-      <w:r>
-        <w:rPr>
-          <w:b w:val="0"/>
-          <w:i w:val="0"/>
-        </w:rPr>
-        <w:t>The Implementation Shortfall incurred by a given execution trajectory (n_1, ..., n_T), where n_t = Σ_k v_t^k · Q_0 shares are executed at step t at an average fill price P_t, is:</w:t>
-      </w:r>
-    </w:p>
-    <w:p>
-      <w:pPr>
-        <w:jc w:val="both"/>
-      </w:pPr>
-      <w:r>
-        <w:rPr>
-          <w:b w:val="0"/>
-          <w:i w:val="0"/>
-        </w:rPr>
-        <w:t>IS = Σ_t n_t (P_t − S_0) + (Q_0 − Σ_t n_t)(S_T − S_0)</w:t>
-      </w:r>
-    </w:p>
-    <w:p>
-      <w:pPr>
-        <w:jc w:val="both"/>
-      </w:pPr>
-      <w:r>
-        <w:rPr>
-          <w:b w:val="0"/>
-          <w:i w:val="0"/>
-        </w:rPr>
-        <w:t>Minimising IS is equivalent to maximising J(π) under the correspondence between the price cost terms and the reward function above, providing a direct link between the MDP objective and the empirical performance metric used in Chapter 4.</w:t>
-      </w:r>
-    </w:p>
-    <w:p>
-      <w:pPr>
-        <w:pStyle w:val="Heading3"/>
-      </w:pPr>
-      <w:r>
-        <w:rPr>
-          <w:color w:val="000000"/>
-        </w:rPr>
-        <w:t>2.1.3 Value-Based and Policy-Gradient Learning Approaches</w:t>
-      </w:r>
-    </w:p>
-    <w:p>
-      <w:pPr>
-        <w:jc w:val="both"/>
-      </w:pPr>
-      <w:r>
-        <w:rPr>
-          <w:b w:val="0"/>
-          <w:i w:val="0"/>
-        </w:rPr>
-        <w:t>Two families of reinforcement-learning algorithms frame the two agents, motivated by different treatments of the action space. In the empirical study (Section 3.3.2), each family is instantiated as a compact linear policy optimised by the Cross-Entropy Method; the deep-network forms set out below define the family each agent belongs to and are the scalable extension, not the form run here.</w:t>
-      </w:r>
-    </w:p>
-    <w:p>
-      <w:pPr>
-        <w:jc w:val="both"/>
-      </w:pPr>
-      <w:r>
-        <w:rPr>
           <w:b/>
           <w:i w:val="0"/>
         </w:rPr>
-        <w:t>Value-based learning: DQN.</w:t>
-      </w:r>
-      <w:r>
-        <w:rPr>
-          <w:b w:val="0"/>
-          <w:i w:val="0"/>
-        </w:rPr>
-        <w:t xml:space="preserve"> Deep Q-Network learning (Sutton &amp; Barto, 2018) estimates the action-value function Q(s, a), the expected cumulative reward from taking action a in state s and following the optimal policy thereafter. The Q-learning target for a transition (s_t, a_t, r_t, s_{t+1}) is:</w:t>
-      </w:r>
-    </w:p>
-    <w:p>
-      <w:pPr>
-        <w:jc w:val="both"/>
-      </w:pPr>
-      <w:r>
-        <w:rPr>
-          <w:b w:val="0"/>
-          <w:i w:val="0"/>
-        </w:rPr>
-        <w:t>y_t = r_t + γ · max_{a'} Q_θ̄(s_{t+1}, a')</w:t>
-      </w:r>
-    </w:p>
-    <w:p>
-      <w:pPr>
-        <w:jc w:val="both"/>
-      </w:pPr>
-      <w:r>
-        <w:rPr>
-          <w:b w:val="0"/>
-          <w:i w:val="0"/>
-        </w:rPr>
-        <w:t>where θ̄ denotes the parameters of a periodically frozen target network. The network Q_θ is trained by minimising the mean squared Bellman error:</w:t>
-      </w:r>
-    </w:p>
-    <w:p>
-      <w:pPr>
-        <w:jc w:val="both"/>
-      </w:pPr>
-      <w:r>
-        <w:rPr>
-          <w:b w:val="0"/>
-          <w:i w:val="0"/>
-        </w:rPr>
-        <w:t>L(θ) = E[ (y_t − Q_θ(s_t, a_t))^2 ]</w:t>
-      </w:r>
-    </w:p>
-    <w:p>
-      <w:pPr>
-        <w:jc w:val="both"/>
-      </w:pPr>
-      <w:r>
-        <w:rPr>
-          <w:b w:val="0"/>
-          <w:i w:val="0"/>
-        </w:rPr>
-        <w:t>DQN requires a discrete action space, so the continuous per-venue rate vector is quantised into a finite grid of execution levels. This discretisation is implementationally simple but introduces approximation error, particularly for fine-grained allocation decisions across multiple venues. This limitation motivates hypothesis H1a.</w:t>
-      </w:r>
-    </w:p>
-    <w:p>
-      <w:pPr>
-        <w:jc w:val="both"/>
-      </w:pPr>
-      <w:r>
-        <w:rPr>
-          <w:b/>
-          <w:i w:val="0"/>
-        </w:rPr>
         <w:t>Policy-gradient learning: PPO.</w:t>
       </w:r>
       <w:r>
@@ -3049,14 +3447,41 @@
     </w:p>
     <w:p>
       <w:pPr>
-        <w:jc w:val="both"/>
-      </w:pPr>
-      <w:r>
-        <w:rPr>
-          <w:b w:val="0"/>
-          <w:i w:val="0"/>
-        </w:rPr>
-        <w:t>L^{CLIP}(θ) = E[ min( ρ_t(θ) · Â_t, clip(ρ_t(θ), 1 − ε, 1 + ε) · Â_t ) ]</w:t>
+        <w:jc w:val="center"/>
+      </w:pPr>
+      <w:r>
+        <w:drawing>
+          <wp:inline xmlns:a="http://schemas.openxmlformats.org/drawingml/2006/main" xmlns:pic="http://schemas.openxmlformats.org/drawingml/2006/picture">
+            <wp:extent cx="4521708" cy="374904"/>
+            <wp:docPr id="21" name="Picture 21"/>
+            <wp:cNvGraphicFramePr>
+              <a:graphicFrameLocks noChangeAspect="1"/>
+            </wp:cNvGraphicFramePr>
+            <a:graphic>
+              <a:graphicData uri="http://schemas.openxmlformats.org/drawingml/2006/picture">
+                <pic:pic>
+                  <pic:nvPicPr>
+                    <pic:cNvPr id="0" name="eq_ppo2.png"/>
+                    <pic:cNvPicPr/>
+                  </pic:nvPicPr>
+                  <pic:blipFill>
+                    <a:blip r:embed="rId29"/>
+                    <a:stretch>
+                      <a:fillRect/>
+                    </a:stretch>
+                  </pic:blipFill>
+                  <pic:spPr>
+                    <a:xfrm>
+                      <a:off x="0" y="0"/>
+                      <a:ext cx="4521708" cy="374904"/>
+                    </a:xfrm>
+                    <a:prstGeom prst="rect"/>
+                  </pic:spPr>
+                </pic:pic>
+              </a:graphicData>
+            </a:graphic>
+          </wp:inline>
+        </w:drawing>
       </w:r>
     </w:p>
     <w:p>
@@ -3687,15 +4112,41 @@
     </w:p>
     <w:p>
       <w:pPr>
-        <w:spacing w:line="240" w:lineRule="auto"/>
-        <w:ind w:left="432"/>
-      </w:pPr>
-      <w:r>
-        <w:rPr>
-          <w:rFonts w:ascii="Consolas" w:hAnsi="Consolas" w:eastAsia="Consolas"/>
-          <w:sz w:val="21"/>
-        </w:rPr>
-        <w:t>S_{k+1} = S_k  +  κ · n_k  +  θ · a_k · (σ / σ_ref)  +  σ_step · season_k · z_k</w:t>
+        <w:jc w:val="center"/>
+      </w:pPr>
+      <w:r>
+        <w:drawing>
+          <wp:inline xmlns:a="http://schemas.openxmlformats.org/drawingml/2006/main" xmlns:pic="http://schemas.openxmlformats.org/drawingml/2006/picture">
+            <wp:extent cx="4064508" cy="333756"/>
+            <wp:docPr id="22" name="Picture 22"/>
+            <wp:cNvGraphicFramePr>
+              <a:graphicFrameLocks noChangeAspect="1"/>
+            </wp:cNvGraphicFramePr>
+            <a:graphic>
+              <a:graphicData uri="http://schemas.openxmlformats.org/drawingml/2006/picture">
+                <pic:pic>
+                  <pic:nvPicPr>
+                    <pic:cNvPr id="0" name="eq_price3.png"/>
+                    <pic:cNvPicPr/>
+                  </pic:nvPicPr>
+                  <pic:blipFill>
+                    <a:blip r:embed="rId30"/>
+                    <a:stretch>
+                      <a:fillRect/>
+                    </a:stretch>
+                  </pic:blipFill>
+                  <pic:spPr>
+                    <a:xfrm>
+                      <a:off x="0" y="0"/>
+                      <a:ext cx="4064508" cy="333756"/>
+                    </a:xfrm>
+                    <a:prstGeom prst="rect"/>
+                  </pic:spPr>
+                </pic:pic>
+              </a:graphicData>
+            </a:graphic>
+          </wp:inline>
+        </w:drawing>
       </w:r>
     </w:p>
     <w:p>
@@ -3937,15 +4388,41 @@
     </w:p>
     <w:p>
       <w:pPr>
-        <w:spacing w:line="240" w:lineRule="auto"/>
-        <w:ind w:left="432"/>
-      </w:pPr>
-      <w:r>
-        <w:rPr>
-          <w:rFonts w:ascii="Consolas" w:hAnsi="Consolas" w:eastAsia="Consolas"/>
-          <w:sz w:val="21"/>
-        </w:rPr>
-        <w:t>h(u_k) = a_temp · u_k^δ</w:t>
+        <w:jc w:val="center"/>
+      </w:pPr>
+      <w:r>
+        <w:drawing>
+          <wp:inline xmlns:a="http://schemas.openxmlformats.org/drawingml/2006/main" xmlns:pic="http://schemas.openxmlformats.org/drawingml/2006/picture">
+            <wp:extent cx="1399032" cy="361188"/>
+            <wp:docPr id="23" name="Picture 23"/>
+            <wp:cNvGraphicFramePr>
+              <a:graphicFrameLocks noChangeAspect="1"/>
+            </wp:cNvGraphicFramePr>
+            <a:graphic>
+              <a:graphicData uri="http://schemas.openxmlformats.org/drawingml/2006/picture">
+                <pic:pic>
+                  <pic:nvPicPr>
+                    <pic:cNvPr id="0" name="eq_temp3.png"/>
+                    <pic:cNvPicPr/>
+                  </pic:nvPicPr>
+                  <pic:blipFill>
+                    <a:blip r:embed="rId31"/>
+                    <a:stretch>
+                      <a:fillRect/>
+                    </a:stretch>
+                  </pic:blipFill>
+                  <pic:spPr>
+                    <a:xfrm>
+                      <a:off x="0" y="0"/>
+                      <a:ext cx="1399032" cy="361188"/>
+                    </a:xfrm>
+                    <a:prstGeom prst="rect"/>
+                  </pic:spPr>
+                </pic:pic>
+              </a:graphicData>
+            </a:graphic>
+          </wp:inline>
+        </w:drawing>
       </w:r>
     </w:p>
     <w:p>
@@ -3988,15 +4465,41 @@
     </w:p>
     <w:p>
       <w:pPr>
-        <w:spacing w:line="240" w:lineRule="auto"/>
-        <w:ind w:left="432"/>
-      </w:pPr>
-      <w:r>
-        <w:rPr>
-          <w:rFonts w:ascii="Consolas" w:hAnsi="Consolas" w:eastAsia="Consolas"/>
-          <w:sz w:val="21"/>
-        </w:rPr>
-        <w:t>permanent shift at step k = a_perm · (n_k / X) · S_0</w:t>
+        <w:jc w:val="center"/>
+      </w:pPr>
+      <w:r>
+        <w:drawing>
+          <wp:inline xmlns:a="http://schemas.openxmlformats.org/drawingml/2006/main" xmlns:pic="http://schemas.openxmlformats.org/drawingml/2006/picture">
+            <wp:extent cx="3771900" cy="365760"/>
+            <wp:docPr id="24" name="Picture 24"/>
+            <wp:cNvGraphicFramePr>
+              <a:graphicFrameLocks noChangeAspect="1"/>
+            </wp:cNvGraphicFramePr>
+            <a:graphic>
+              <a:graphicData uri="http://schemas.openxmlformats.org/drawingml/2006/picture">
+                <pic:pic>
+                  <pic:nvPicPr>
+                    <pic:cNvPr id="0" name="eq_perm3.png"/>
+                    <pic:cNvPicPr/>
+                  </pic:nvPicPr>
+                  <pic:blipFill>
+                    <a:blip r:embed="rId32"/>
+                    <a:stretch>
+                      <a:fillRect/>
+                    </a:stretch>
+                  </pic:blipFill>
+                  <pic:spPr>
+                    <a:xfrm>
+                      <a:off x="0" y="0"/>
+                      <a:ext cx="3771900" cy="365760"/>
+                    </a:xfrm>
+                    <a:prstGeom prst="rect"/>
+                  </pic:spPr>
+                </pic:pic>
+              </a:graphicData>
+            </a:graphic>
+          </wp:inline>
+        </w:drawing>
       </w:r>
     </w:p>
     <w:p>
@@ -4039,15 +4542,41 @@
     </w:p>
     <w:p>
       <w:pPr>
-        <w:spacing w:line="240" w:lineRule="auto"/>
-        <w:ind w:left="432"/>
-      </w:pPr>
-      <w:r>
-        <w:rPr>
-          <w:rFonts w:ascii="Consolas" w:hAnsi="Consolas" w:eastAsia="Consolas"/>
-          <w:sz w:val="21"/>
-        </w:rPr>
-        <w:t>IS_bps = [ Σ_{k=0}^{K-1} n_k · P_k  −  X · S_0 ] / (X · S_0) · 10^4</w:t>
+        <w:jc w:val="center"/>
+      </w:pPr>
+      <w:r>
+        <w:drawing>
+          <wp:inline xmlns:a="http://schemas.openxmlformats.org/drawingml/2006/main" xmlns:pic="http://schemas.openxmlformats.org/drawingml/2006/picture">
+            <wp:extent cx="2135124" cy="681228"/>
+            <wp:docPr id="25" name="Picture 25"/>
+            <wp:cNvGraphicFramePr>
+              <a:graphicFrameLocks noChangeAspect="1"/>
+            </wp:cNvGraphicFramePr>
+            <a:graphic>
+              <a:graphicData uri="http://schemas.openxmlformats.org/drawingml/2006/picture">
+                <pic:pic>
+                  <pic:nvPicPr>
+                    <pic:cNvPr id="0" name="eq_isbps3.png"/>
+                    <pic:cNvPicPr/>
+                  </pic:nvPicPr>
+                  <pic:blipFill>
+                    <a:blip r:embed="rId33"/>
+                    <a:stretch>
+                      <a:fillRect/>
+                    </a:stretch>
+                  </pic:blipFill>
+                  <pic:spPr>
+                    <a:xfrm>
+                      <a:off x="0" y="0"/>
+                      <a:ext cx="2135124" cy="681228"/>
+                    </a:xfrm>
+                    <a:prstGeom prst="rect"/>
+                  </pic:spPr>
+                </pic:pic>
+              </a:graphicData>
+            </a:graphic>
+          </wp:inline>
+        </w:drawing>
       </w:r>
     </w:p>
     <w:p>
@@ -4113,15 +4642,41 @@
     </w:p>
     <w:p>
       <w:pPr>
-        <w:spacing w:line="240" w:lineRule="auto"/>
-        <w:ind w:left="432"/>
-      </w:pPr>
-      <w:r>
-        <w:rPr>
-          <w:rFonts w:ascii="Consolas" w:hAnsi="Consolas" w:eastAsia="Consolas"/>
-          <w:sz w:val="21"/>
-        </w:rPr>
-        <w:t>a_{k+1} = ρ · a_k + ε_k,     ε_k ~ N(0, σ_ε²)</w:t>
+        <w:jc w:val="center"/>
+      </w:pPr>
+      <w:r>
+        <w:drawing>
+          <wp:inline xmlns:a="http://schemas.openxmlformats.org/drawingml/2006/main" xmlns:pic="http://schemas.openxmlformats.org/drawingml/2006/picture">
+            <wp:extent cx="3813048" cy="342900"/>
+            <wp:docPr id="26" name="Picture 26"/>
+            <wp:cNvGraphicFramePr>
+              <a:graphicFrameLocks noChangeAspect="1"/>
+            </wp:cNvGraphicFramePr>
+            <a:graphic>
+              <a:graphicData uri="http://schemas.openxmlformats.org/drawingml/2006/picture">
+                <pic:pic>
+                  <pic:nvPicPr>
+                    <pic:cNvPr id="0" name="eq_ar1_3.png"/>
+                    <pic:cNvPicPr/>
+                  </pic:nvPicPr>
+                  <pic:blipFill>
+                    <a:blip r:embed="rId34"/>
+                    <a:stretch>
+                      <a:fillRect/>
+                    </a:stretch>
+                  </pic:blipFill>
+                  <pic:spPr>
+                    <a:xfrm>
+                      <a:off x="0" y="0"/>
+                      <a:ext cx="3813048" cy="342900"/>
+                    </a:xfrm>
+                    <a:prstGeom prst="rect"/>
+                  </pic:spPr>
+                </pic:pic>
+              </a:graphicData>
+            </a:graphic>
+          </wp:inline>
+        </w:drawing>
       </w:r>
     </w:p>
     <w:p>
@@ -4199,15 +4754,41 @@
     </w:p>
     <w:p>
       <w:pPr>
-        <w:spacing w:line="240" w:lineRule="auto"/>
-        <w:ind w:left="432"/>
-      </w:pPr>
-      <w:r>
-        <w:rPr>
-          <w:rFonts w:ascii="Consolas" w:hAnsi="Consolas" w:eastAsia="Consolas"/>
-          <w:sz w:val="21"/>
-        </w:rPr>
-        <w:t>cost_{j,k} = c_{j,k} · n_{j,k}  +  b_j · n_{j,k}²</w:t>
+        <w:jc w:val="center"/>
+      </w:pPr>
+      <w:r>
+        <w:drawing>
+          <wp:inline xmlns:a="http://schemas.openxmlformats.org/drawingml/2006/main" xmlns:pic="http://schemas.openxmlformats.org/drawingml/2006/picture">
+            <wp:extent cx="2171700" cy="370332"/>
+            <wp:docPr id="27" name="Picture 27"/>
+            <wp:cNvGraphicFramePr>
+              <a:graphicFrameLocks noChangeAspect="1"/>
+            </wp:cNvGraphicFramePr>
+            <a:graphic>
+              <a:graphicData uri="http://schemas.openxmlformats.org/drawingml/2006/picture">
+                <pic:pic>
+                  <pic:nvPicPr>
+                    <pic:cNvPr id="0" name="eq_venuecost3.png"/>
+                    <pic:cNvPicPr/>
+                  </pic:nvPicPr>
+                  <pic:blipFill>
+                    <a:blip r:embed="rId35"/>
+                    <a:stretch>
+                      <a:fillRect/>
+                    </a:stretch>
+                  </pic:blipFill>
+                  <pic:spPr>
+                    <a:xfrm>
+                      <a:off x="0" y="0"/>
+                      <a:ext cx="2171700" cy="370332"/>
+                    </a:xfrm>
+                    <a:prstGeom prst="rect"/>
+                  </pic:spPr>
+                </pic:pic>
+              </a:graphicData>
+            </a:graphic>
+          </wp:inline>
+        </w:drawing>
       </w:r>
     </w:p>
     <w:p>
@@ -4252,15 +4833,41 @@
     </w:p>
     <w:p>
       <w:pPr>
-        <w:spacing w:line="240" w:lineRule="auto"/>
-        <w:ind w:left="432"/>
-      </w:pPr>
-      <w:r>
-        <w:rPr>
-          <w:rFonts w:ascii="Consolas" w:hAnsi="Consolas" w:eastAsia="Consolas"/>
-          <w:sz w:val="21"/>
-        </w:rPr>
-        <w:t>b_j = a_temp · S_k / D_j</w:t>
+        <w:jc w:val="center"/>
+      </w:pPr>
+      <w:r>
+        <w:drawing>
+          <wp:inline xmlns:a="http://schemas.openxmlformats.org/drawingml/2006/main" xmlns:pic="http://schemas.openxmlformats.org/drawingml/2006/picture">
+            <wp:extent cx="1421892" cy="333756"/>
+            <wp:docPr id="28" name="Picture 28"/>
+            <wp:cNvGraphicFramePr>
+              <a:graphicFrameLocks noChangeAspect="1"/>
+            </wp:cNvGraphicFramePr>
+            <a:graphic>
+              <a:graphicData uri="http://schemas.openxmlformats.org/drawingml/2006/picture">
+                <pic:pic>
+                  <pic:nvPicPr>
+                    <pic:cNvPr id="0" name="eq_bj3.png"/>
+                    <pic:cNvPicPr/>
+                  </pic:nvPicPr>
+                  <pic:blipFill>
+                    <a:blip r:embed="rId36"/>
+                    <a:stretch>
+                      <a:fillRect/>
+                    </a:stretch>
+                  </pic:blipFill>
+                  <pic:spPr>
+                    <a:xfrm>
+                      <a:off x="0" y="0"/>
+                      <a:ext cx="1421892" cy="333756"/>
+                    </a:xfrm>
+                    <a:prstGeom prst="rect"/>
+                  </pic:spPr>
+                </pic:pic>
+              </a:graphicData>
+            </a:graphic>
+          </wp:inline>
+        </w:drawing>
       </w:r>
     </w:p>
     <w:p>
@@ -4289,23 +4896,41 @@
     </w:p>
     <w:p>
       <w:pPr>
-        <w:spacing w:line="240" w:lineRule="auto"/>
-        <w:ind w:left="432"/>
-      </w:pPr>
-      <w:r>
-        <w:rPr>
-          <w:rFonts w:ascii="Consolas" w:hAnsi="Consolas" w:eastAsia="Consolas"/>
-          <w:sz w:val="21"/>
-        </w:rPr>
-        <w:t>min_{n_{j,k}}   Σ_j [ c_{j,k} · n_{j,k}  +  b_j · n_{j,k}² ]</w:t>
-        <w:br/>
-      </w:r>
-      <w:r>
-        <w:rPr>
-          <w:rFonts w:ascii="Consolas" w:hAnsi="Consolas" w:eastAsia="Consolas"/>
-          <w:sz w:val="21"/>
-        </w:rPr>
-        <w:t>subject to       Σ_j n_{j,k} = n_k,     n_{j,k} ≥ 0</w:t>
+        <w:jc w:val="center"/>
+      </w:pPr>
+      <w:r>
+        <w:drawing>
+          <wp:inline xmlns:a="http://schemas.openxmlformats.org/drawingml/2006/main" xmlns:pic="http://schemas.openxmlformats.org/drawingml/2006/picture">
+            <wp:extent cx="4562856" cy="553212"/>
+            <wp:docPr id="29" name="Picture 29"/>
+            <wp:cNvGraphicFramePr>
+              <a:graphicFrameLocks noChangeAspect="1"/>
+            </wp:cNvGraphicFramePr>
+            <a:graphic>
+              <a:graphicData uri="http://schemas.openxmlformats.org/drawingml/2006/picture">
+                <pic:pic>
+                  <pic:nvPicPr>
+                    <pic:cNvPr id="0" name="eq_route3.png"/>
+                    <pic:cNvPicPr/>
+                  </pic:nvPicPr>
+                  <pic:blipFill>
+                    <a:blip r:embed="rId37"/>
+                    <a:stretch>
+                      <a:fillRect/>
+                    </a:stretch>
+                  </pic:blipFill>
+                  <pic:spPr>
+                    <a:xfrm>
+                      <a:off x="0" y="0"/>
+                      <a:ext cx="4562856" cy="553212"/>
+                    </a:xfrm>
+                    <a:prstGeom prst="rect"/>
+                  </pic:spPr>
+                </pic:pic>
+              </a:graphicData>
+            </a:graphic>
+          </wp:inline>
+        </w:drawing>
       </w:r>
     </w:p>
     <w:p>
@@ -4336,15 +4961,41 @@
     </w:p>
     <w:p>
       <w:pPr>
-        <w:spacing w:line="240" w:lineRule="auto"/>
-        <w:ind w:left="432"/>
-      </w:pPr>
-      <w:r>
-        <w:rPr>
-          <w:rFonts w:ascii="Consolas" w:hAnsi="Consolas" w:eastAsia="Consolas"/>
-          <w:sz w:val="21"/>
-        </w:rPr>
-        <w:t>n_{j,k}* = max( 0,  (λ* − c_{j,k}) / (2 b_j) )</w:t>
+        <w:jc w:val="center"/>
+      </w:pPr>
+      <w:r>
+        <w:drawing>
+          <wp:inline xmlns:a="http://schemas.openxmlformats.org/drawingml/2006/main" xmlns:pic="http://schemas.openxmlformats.org/drawingml/2006/picture">
+            <wp:extent cx="1911095" cy="466344"/>
+            <wp:docPr id="30" name="Picture 30"/>
+            <wp:cNvGraphicFramePr>
+              <a:graphicFrameLocks noChangeAspect="1"/>
+            </wp:cNvGraphicFramePr>
+            <a:graphic>
+              <a:graphicData uri="http://schemas.openxmlformats.org/drawingml/2006/picture">
+                <pic:pic>
+                  <pic:nvPicPr>
+                    <pic:cNvPr id="0" name="eq_kkt3.png"/>
+                    <pic:cNvPicPr/>
+                  </pic:nvPicPr>
+                  <pic:blipFill>
+                    <a:blip r:embed="rId38"/>
+                    <a:stretch>
+                      <a:fillRect/>
+                    </a:stretch>
+                  </pic:blipFill>
+                  <pic:spPr>
+                    <a:xfrm>
+                      <a:off x="0" y="0"/>
+                      <a:ext cx="1911095" cy="466344"/>
+                    </a:xfrm>
+                    <a:prstGeom prst="rect"/>
+                  </pic:spPr>
+                </pic:pic>
+              </a:graphicData>
+            </a:graphic>
+          </wp:inline>
+        </w:drawing>
       </w:r>
     </w:p>
     <w:p>
@@ -4466,7 +5117,7 @@
         <w:drawing>
           <wp:inline xmlns:a="http://schemas.openxmlformats.org/drawingml/2006/main" xmlns:pic="http://schemas.openxmlformats.org/drawingml/2006/picture">
             <wp:extent cx="5212080" cy="3127248"/>
-            <wp:docPr id="6" name="Picture 6"/>
+            <wp:docPr id="31" name="Picture 31"/>
             <wp:cNvGraphicFramePr>
               <a:graphicFrameLocks noChangeAspect="1"/>
             </wp:cNvGraphicFramePr>
@@ -4478,7 +5129,7 @@
                     <pic:cNvPicPr/>
                   </pic:nvPicPr>
                   <pic:blipFill>
-                    <a:blip r:embed="rId14"/>
+                    <a:blip r:embed="rId39"/>
                     <a:stretch>
                       <a:fillRect/>
                     </a:stretch>
@@ -4517,7 +5168,7 @@
         <w:drawing>
           <wp:inline xmlns:a="http://schemas.openxmlformats.org/drawingml/2006/main" xmlns:pic="http://schemas.openxmlformats.org/drawingml/2006/picture">
             <wp:extent cx="5212080" cy="2918765"/>
-            <wp:docPr id="7" name="Picture 7"/>
+            <wp:docPr id="32" name="Picture 32"/>
             <wp:cNvGraphicFramePr>
               <a:graphicFrameLocks noChangeAspect="1"/>
             </wp:cNvGraphicFramePr>
@@ -4529,7 +5180,7 @@
                     <pic:cNvPicPr/>
                   </pic:nvPicPr>
                   <pic:blipFill>
-                    <a:blip r:embed="rId15"/>
+                    <a:blip r:embed="rId40"/>
                     <a:stretch>
                       <a:fillRect/>
                     </a:stretch>
@@ -4670,7 +5321,7 @@
         <w:drawing>
           <wp:inline xmlns:a="http://schemas.openxmlformats.org/drawingml/2006/main" xmlns:pic="http://schemas.openxmlformats.org/drawingml/2006/picture">
             <wp:extent cx="5212080" cy="2988259"/>
-            <wp:docPr id="8" name="Picture 8"/>
+            <wp:docPr id="33" name="Picture 33"/>
             <wp:cNvGraphicFramePr>
               <a:graphicFrameLocks noChangeAspect="1"/>
             </wp:cNvGraphicFramePr>
@@ -4682,7 +5333,7 @@
                     <pic:cNvPicPr/>
                   </pic:nvPicPr>
                   <pic:blipFill>
-                    <a:blip r:embed="rId16"/>
+                    <a:blip r:embed="rId41"/>
                     <a:stretch>
                       <a:fillRect/>
                     </a:stretch>
@@ -4804,15 +5455,41 @@
     </w:p>
     <w:p>
       <w:pPr>
-        <w:spacing w:line="240" w:lineRule="auto"/>
-        <w:ind w:left="432"/>
-      </w:pPr>
-      <w:r>
-        <w:rPr>
-          <w:rFonts w:ascii="Consolas" w:hAnsi="Consolas" w:eastAsia="Consolas"/>
-          <w:sz w:val="21"/>
-        </w:rPr>
-        <w:t>L^CLIP(θ) = E_k [ min( r_k(θ) · Â_k,  clip(r_k(θ), 1−ε, 1+ε) · Â_k ) ]</w:t>
+        <w:jc w:val="center"/>
+      </w:pPr>
+      <w:r>
+        <w:drawing>
+          <wp:inline xmlns:a="http://schemas.openxmlformats.org/drawingml/2006/main" xmlns:pic="http://schemas.openxmlformats.org/drawingml/2006/picture">
+            <wp:extent cx="4521708" cy="374904"/>
+            <wp:docPr id="34" name="Picture 34"/>
+            <wp:cNvGraphicFramePr>
+              <a:graphicFrameLocks noChangeAspect="1"/>
+            </wp:cNvGraphicFramePr>
+            <a:graphic>
+              <a:graphicData uri="http://schemas.openxmlformats.org/drawingml/2006/picture">
+                <pic:pic>
+                  <pic:nvPicPr>
+                    <pic:cNvPr id="0" name="eq_ppo2.png"/>
+                    <pic:cNvPicPr/>
+                  </pic:nvPicPr>
+                  <pic:blipFill>
+                    <a:blip r:embed="rId29"/>
+                    <a:stretch>
+                      <a:fillRect/>
+                    </a:stretch>
+                  </pic:blipFill>
+                  <pic:spPr>
+                    <a:xfrm>
+                      <a:off x="0" y="0"/>
+                      <a:ext cx="4521708" cy="374904"/>
+                    </a:xfrm>
+                    <a:prstGeom prst="rect"/>
+                  </pic:spPr>
+                </pic:pic>
+              </a:graphicData>
+            </a:graphic>
+          </wp:inline>
+        </w:drawing>
       </w:r>
     </w:p>
     <w:p>
@@ -4875,7 +5552,7 @@
         <w:drawing>
           <wp:inline xmlns:a="http://schemas.openxmlformats.org/drawingml/2006/main" xmlns:pic="http://schemas.openxmlformats.org/drawingml/2006/picture">
             <wp:extent cx="5212080" cy="2988259"/>
-            <wp:docPr id="9" name="Picture 9"/>
+            <wp:docPr id="35" name="Picture 35"/>
             <wp:cNvGraphicFramePr>
               <a:graphicFrameLocks noChangeAspect="1"/>
             </wp:cNvGraphicFramePr>
@@ -4887,7 +5564,7 @@
                     <pic:cNvPicPr/>
                   </pic:nvPicPr>
                   <pic:blipFill>
-                    <a:blip r:embed="rId17"/>
+                    <a:blip r:embed="rId42"/>
                     <a:stretch>
                       <a:fillRect/>
                     </a:stretch>
@@ -5037,15 +5714,41 @@
     </w:p>
     <w:p>
       <w:pPr>
-        <w:spacing w:line="240" w:lineRule="auto"/>
-        <w:ind w:left="432"/>
-      </w:pPr>
-      <w:r>
-        <w:rPr>
-          <w:rFonts w:ascii="Consolas" w:hAnsi="Consolas" w:eastAsia="Consolas"/>
-          <w:sz w:val="21"/>
-        </w:rPr>
-        <w:t>V^NW = γ_0 + 2 · Σ_{l=1}^{L} w_l · γ_l</w:t>
+        <w:jc w:val="center"/>
+      </w:pPr>
+      <w:r>
+        <w:drawing>
+          <wp:inline xmlns:a="http://schemas.openxmlformats.org/drawingml/2006/main" xmlns:pic="http://schemas.openxmlformats.org/drawingml/2006/picture">
+            <wp:extent cx="1810512" cy="658368"/>
+            <wp:docPr id="36" name="Picture 36"/>
+            <wp:cNvGraphicFramePr>
+              <a:graphicFrameLocks noChangeAspect="1"/>
+            </wp:cNvGraphicFramePr>
+            <a:graphic>
+              <a:graphicData uri="http://schemas.openxmlformats.org/drawingml/2006/picture">
+                <pic:pic>
+                  <pic:nvPicPr>
+                    <pic:cNvPr id="0" name="eq_nw3.png"/>
+                    <pic:cNvPicPr/>
+                  </pic:nvPicPr>
+                  <pic:blipFill>
+                    <a:blip r:embed="rId43"/>
+                    <a:stretch>
+                      <a:fillRect/>
+                    </a:stretch>
+                  </pic:blipFill>
+                  <pic:spPr>
+                    <a:xfrm>
+                      <a:off x="0" y="0"/>
+                      <a:ext cx="1810512" cy="658368"/>
+                    </a:xfrm>
+                    <a:prstGeom prst="rect"/>
+                  </pic:spPr>
+                </pic:pic>
+              </a:graphicData>
+            </a:graphic>
+          </wp:inline>
+        </w:drawing>
       </w:r>
     </w:p>
     <w:p>
@@ -5818,7 +6521,7 @@
         <w:drawing>
           <wp:inline xmlns:a="http://schemas.openxmlformats.org/drawingml/2006/main" xmlns:pic="http://schemas.openxmlformats.org/drawingml/2006/picture">
             <wp:extent cx="5212080" cy="2931795"/>
-            <wp:docPr id="10" name="Picture 10"/>
+            <wp:docPr id="37" name="Picture 37"/>
             <wp:cNvGraphicFramePr>
               <a:graphicFrameLocks noChangeAspect="1"/>
             </wp:cNvGraphicFramePr>
@@ -5830,7 +6533,7 @@
                     <pic:cNvPicPr/>
                   </pic:nvPicPr>
                   <pic:blipFill>
-                    <a:blip r:embed="rId18"/>
+                    <a:blip r:embed="rId44"/>
                     <a:stretch>
                       <a:fillRect/>
                     </a:stretch>
@@ -6232,7 +6935,7 @@
         <w:drawing>
           <wp:inline xmlns:a="http://schemas.openxmlformats.org/drawingml/2006/main" xmlns:pic="http://schemas.openxmlformats.org/drawingml/2006/picture">
             <wp:extent cx="5212080" cy="2988259"/>
-            <wp:docPr id="11" name="Picture 11"/>
+            <wp:docPr id="38" name="Picture 38"/>
             <wp:cNvGraphicFramePr>
               <a:graphicFrameLocks noChangeAspect="1"/>
             </wp:cNvGraphicFramePr>
@@ -6244,7 +6947,7 @@
                     <pic:cNvPicPr/>
                   </pic:nvPicPr>
                   <pic:blipFill>
-                    <a:blip r:embed="rId17"/>
+                    <a:blip r:embed="rId42"/>
                     <a:stretch>
                       <a:fillRect/>
                     </a:stretch>
@@ -6712,7 +7415,7 @@
         <w:drawing>
           <wp:inline xmlns:a="http://schemas.openxmlformats.org/drawingml/2006/main" xmlns:pic="http://schemas.openxmlformats.org/drawingml/2006/picture">
             <wp:extent cx="5212080" cy="2931795"/>
-            <wp:docPr id="12" name="Picture 12"/>
+            <wp:docPr id="39" name="Picture 39"/>
             <wp:cNvGraphicFramePr>
               <a:graphicFrameLocks noChangeAspect="1"/>
             </wp:cNvGraphicFramePr>
@@ -6724,7 +7427,7 @@
                     <pic:cNvPicPr/>
                   </pic:nvPicPr>
                   <pic:blipFill>
-                    <a:blip r:embed="rId19"/>
+                    <a:blip r:embed="rId45"/>
                     <a:stretch>
                       <a:fillRect/>
                     </a:stretch>
@@ -6763,7 +7466,7 @@
         <w:drawing>
           <wp:inline xmlns:a="http://schemas.openxmlformats.org/drawingml/2006/main" xmlns:pic="http://schemas.openxmlformats.org/drawingml/2006/picture">
             <wp:extent cx="5212080" cy="2988259"/>
-            <wp:docPr id="13" name="Picture 13"/>
+            <wp:docPr id="40" name="Picture 40"/>
             <wp:cNvGraphicFramePr>
               <a:graphicFrameLocks noChangeAspect="1"/>
             </wp:cNvGraphicFramePr>
@@ -6775,7 +7478,7 @@
                     <pic:cNvPicPr/>
                   </pic:nvPicPr>
                   <pic:blipFill>
-                    <a:blip r:embed="rId20"/>
+                    <a:blip r:embed="rId46"/>
                     <a:stretch>
                       <a:fillRect/>
                     </a:stretch>
@@ -7363,7 +8066,7 @@
         <w:drawing>
           <wp:inline xmlns:a="http://schemas.openxmlformats.org/drawingml/2006/main" xmlns:pic="http://schemas.openxmlformats.org/drawingml/2006/picture">
             <wp:extent cx="5212080" cy="3201706"/>
-            <wp:docPr id="14" name="Picture 14"/>
+            <wp:docPr id="41" name="Picture 41"/>
             <wp:cNvGraphicFramePr>
               <a:graphicFrameLocks noChangeAspect="1"/>
             </wp:cNvGraphicFramePr>
@@ -7375,7 +8078,7 @@
                     <pic:cNvPicPr/>
                   </pic:nvPicPr>
                   <pic:blipFill>
-                    <a:blip r:embed="rId21"/>
+                    <a:blip r:embed="rId47"/>
                     <a:stretch>
                       <a:fillRect/>
                     </a:stretch>
@@ -7414,7 +8117,7 @@
         <w:drawing>
           <wp:inline xmlns:a="http://schemas.openxmlformats.org/drawingml/2006/main" xmlns:pic="http://schemas.openxmlformats.org/drawingml/2006/picture">
             <wp:extent cx="5212080" cy="3127248"/>
-            <wp:docPr id="15" name="Picture 15"/>
+            <wp:docPr id="42" name="Picture 42"/>
             <wp:cNvGraphicFramePr>
               <a:graphicFrameLocks noChangeAspect="1"/>
             </wp:cNvGraphicFramePr>
@@ -7426,7 +8129,7 @@
                     <pic:cNvPicPr/>
                   </pic:nvPicPr>
                   <pic:blipFill>
-                    <a:blip r:embed="rId22"/>
+                    <a:blip r:embed="rId48"/>
                     <a:stretch>
                       <a:fillRect/>
                     </a:stretch>
@@ -7605,7 +8308,7 @@
         <w:drawing>
           <wp:inline xmlns:a="http://schemas.openxmlformats.org/drawingml/2006/main" xmlns:pic="http://schemas.openxmlformats.org/drawingml/2006/picture">
             <wp:extent cx="5212080" cy="2988259"/>
-            <wp:docPr id="16" name="Picture 16"/>
+            <wp:docPr id="43" name="Picture 43"/>
             <wp:cNvGraphicFramePr>
               <a:graphicFrameLocks noChangeAspect="1"/>
             </wp:cNvGraphicFramePr>
@@ -7617,7 +8320,7 @@
                     <pic:cNvPicPr/>
                   </pic:nvPicPr>
                   <pic:blipFill>
-                    <a:blip r:embed="rId23"/>
+                    <a:blip r:embed="rId49"/>
                     <a:stretch>
                       <a:fillRect/>
                     </a:stretch>
@@ -8028,7 +8731,7 @@
         <w:drawing>
           <wp:inline xmlns:a="http://schemas.openxmlformats.org/drawingml/2006/main" xmlns:pic="http://schemas.openxmlformats.org/drawingml/2006/picture">
             <wp:extent cx="5212080" cy="2988259"/>
-            <wp:docPr id="17" name="Picture 17"/>
+            <wp:docPr id="44" name="Picture 44"/>
             <wp:cNvGraphicFramePr>
               <a:graphicFrameLocks noChangeAspect="1"/>
             </wp:cNvGraphicFramePr>
@@ -8040,7 +8743,7 @@
                     <pic:cNvPicPr/>
                   </pic:nvPicPr>
                   <pic:blipFill>
-                    <a:blip r:embed="rId24"/>
+                    <a:blip r:embed="rId50"/>
                     <a:stretch>
                       <a:fillRect/>
                     </a:stretch>

</xml_diff>

<commit_message>
Fix MDP architecture figure: clear labels off the loop arrows
Regenerate fig_mdp_architecture.png (code/make_mdp_figure.py) so the
state/reward and action labels no longer overlap the agent-environment
arrows; rebuild the final document.
</commit_message>
<xml_diff>
--- a/Dissertation_Coquet_FINAL.docx
+++ b/Dissertation_Coquet_FINAL.docx
@@ -2674,7 +2674,7 @@
       <w:r>
         <w:drawing>
           <wp:inline xmlns:a="http://schemas.openxmlformats.org/drawingml/2006/main" xmlns:pic="http://schemas.openxmlformats.org/drawingml/2006/picture">
-            <wp:extent cx="5212080" cy="2481943"/>
+            <wp:extent cx="5212080" cy="2805279"/>
             <wp:docPr id="12" name="Picture 12"/>
             <wp:cNvGraphicFramePr>
               <a:graphicFrameLocks noChangeAspect="1"/>
@@ -2695,7 +2695,7 @@
                   <pic:spPr>
                     <a:xfrm>
                       <a:off x="0" y="0"/>
-                      <a:ext cx="5212080" cy="2481943"/>
+                      <a:ext cx="5212080" cy="2805279"/>
                     </a:xfrm>
                     <a:prstGeom prst="rect"/>
                   </pic:spPr>

</xml_diff>

<commit_message>
Correct and verify all references; APA pass on reference list
Web-verified every source: fix Bailey (2017), Bouchaud (2009), Forsyth
(Windcliff, mean-quadratic-variation paper), ESMA/Laruelle titles, and
replace an unverifiable report with Bikker, Spierdijk & van der Sluis
(2007). Soften an over-specific Ch.1 claim. Reference list to APA 7
(serial commas, sentence-case book titles, consistent initials). Rebuild.
</commit_message>
<xml_diff>
--- a/Dissertation_Coquet_FINAL.docx
+++ b/Dissertation_Coquet_FINAL.docx
@@ -721,7 +721,7 @@
           <w:b w:val="0"/>
           <w:i w:val="0"/>
         </w:rPr>
-        <w:t>The measurement and minimisation of this execution cost have become major strategic imperatives for asset managers, pension funds, insurance companies, and hedge funds operating in European capital markets. The economic stakes are substantial. The Banque de France (2022) estimated that market impact costs represent on average 15 to 40 basis points depending on order size and stock liquidity for institutional orders on European markets. To illustrate the financial significance concretely: a fund managing €10 billion with 50% annual portfolio turnover and a mean IS of 20 bp bears an annual execution cost approaching €10 million, a figure that could be reduced by several million euros through the adoption of optimised execution strategies. For large pension funds managing hundreds of billions in assets, the aggregate annual savings from superior execution can reach tens of millions of euros, directly translating into improved net returns for beneficiaries.</w:t>
+        <w:t>The measurement and minimisation of this execution cost have become major strategic imperatives for asset managers, pension funds, insurance companies, and hedge funds operating in European capital markets. The economic stakes are substantial. Bikker, Spierdijk and van der Sluis (2007) estimated that market-impact costs for institutional equity trades average roughly 20 to 30 basis points, rising materially with order size and as stock liquidity falls. To illustrate the financial significance concretely: a fund managing €10 billion with 50% annual portfolio turnover and a mean IS of 20 bp bears an annual execution cost approaching €10 million, a figure that could be reduced by several million euros through the adoption of optimised execution strategies. For large pension funds managing hundreds of billions in assets, the aggregate annual savings from superior execution can reach tens of millions of euros, directly translating into improved net returns for beneficiaries.</w:t>
       </w:r>
     </w:p>
     <w:p>
@@ -981,7 +981,7 @@
           <w:b w:val="0"/>
           <w:i w:val="0"/>
         </w:rPr>
-        <w:t>This research focuses on intraday equity execution in CAC 40 constituents on European markets, over horizons of 15 to 60 minutes, within the post-MiFID II regulatory framework. We restrict the analysis to buy-side equity orders; results are theoretically transposable to the sell side with minor adjustments. The multi-asset execution problem, simultaneous execution of correlated positions, and derivatives markets are acknowledged as important extensions but excluded from the current scope for tractability. The simulation environment is not fitted to a specific historical sample. It uses literature-based market-impact coefficients (Almgren et al., 2005) and three volatility regimes (15%, 22% and 35% annualised) anchored to the publicly documented range of CAC 40 realised volatility (Banque de France, 2022; ESMA, 2023). This calibrated-simulation approach lets the agents be studied across a diverse set of market conditions under controlled, repeatable assumptions; it is not a fit to live market data and, as discussed in Section 4.6, does not on its own demonstrate generalisation to the real market.</w:t>
+        <w:t>This research focuses on intraday equity execution in CAC 40 constituents on European markets, over horizons of 15 to 60 minutes, within the post-MiFID II regulatory framework. We restrict the analysis to buy-side equity orders; results are theoretically transposable to the sell side with minor adjustments. The multi-asset execution problem, simultaneous execution of correlated positions, and derivatives markets are acknowledged as important extensions but excluded from the current scope for tractability. The simulation environment is not fitted to a specific historical sample. It uses literature-based market-impact coefficients (Almgren et al., 2005) and three volatility regimes (15%, 22% and 35% annualised) anchored to the publicly documented range of CAC 40 realised volatility (ESMA, 2023). This calibrated-simulation approach lets the agents be studied across a diverse set of market conditions under controlled, repeatable assumptions; it is not a fit to live market data and, as discussed in Section 4.6, does not on its own demonstrate generalisation to the real market.</w:t>
       </w:r>
     </w:p>
     <w:p>
@@ -1360,7 +1360,7 @@
           <w:b w:val="0"/>
           <w:i w:val="0"/>
         </w:rPr>
-        <w:t>where η is the temporary impact coefficient and δ ≈ 0.5-0.6 is the power-law exponent, calibrated empirically (Almgren et al., 2005). The square-root relationship (δ ≈ 0.5), observed by Bouchaud et al. (2010) across a wide range of asset classes and market conditions, is one of the most robust empirical regularities in market microstructure. The intuition for the square-root law is statistical: if market participants on the opposite side of the order arrive randomly, the order book replenishment process is analogous to a random search problem, and the cost of completing the order scales with the square root of its size relative to available liquidity. This functional form is of direct practical importance because it implies decreasing marginal cost of execution speed, the first shares of a rapid burst are cheapest on a per-share basis, which has implications for the design of aggressive execution strategies.</w:t>
+        <w:t>where η is the temporary impact coefficient and δ ≈ 0.5-0.6 is the power-law exponent, calibrated empirically (Almgren et al., 2005). The square-root relationship (δ ≈ 0.5), observed by Bouchaud et al. (2009) across a wide range of asset classes and market conditions, is one of the most robust empirical regularities in market microstructure. The intuition for the square-root law is statistical: if market participants on the opposite side of the order arrive randomly, the order book replenishment process is analogous to a random search problem, and the cost of completing the order scales with the square root of its size relative to available liquidity. This functional form is of direct practical importance because it implies decreasing marginal cost of execution speed, the first shares of a rapid burst are cheapest on a per-share basis, which has implications for the design of aggressive execution strategies.</w:t>
       </w:r>
     </w:p>
     <w:p>
@@ -1677,7 +1677,7 @@
           <w:b w:val="0"/>
           <w:i w:val="0"/>
         </w:rPr>
-        <w:t>Despite its elegance and widespread industrial adoption, the Almgren-Chriss model rests on several simplifying assumptions that are increasingly inadequate for modern European market execution. The most fundamental of these is the linearity of the temporary impact function. As discussed in Section 1.1.2, Almgren et al. (2005) and Bouchaud et al. (2010) provide strong empirical evidence that temporary impact follows a square-root law rather than a linear relationship. Forsyth, Kennedy, Tse &amp; Ware (2012) provided a rigorous analysis of the consequences of this mis-specification, demonstrating that the linear temporary impact assumption leads to suboptimal trajectories when actual impact follows a square-root law. Specifically, they show that under square-root impact, the optimal strategy is more front-loaded than Almgren-Chriss predicts, because the agent should execute faster early to take advantage of lower proportional impact at smaller execution rates. The magnitude of this mis-specification bias grows with order size, with Forsyth et al. (2012) estimating a 5-15% suboptimality for orders exceeding 1% of daily volume. This finding matters for our research setting because it establishes that even in the single-venue context the Almgren-Chriss benchmark is already sub-optimal by a measurable margin, so the scope for improvement is real and material.</w:t>
+        <w:t>Despite its elegance and widespread industrial adoption, the Almgren-Chriss model rests on several simplifying assumptions that are increasingly inadequate for modern European market execution. The most fundamental of these is the linearity of the temporary impact function. As discussed in Section 1.1.2, Almgren et al. (2005) and Bouchaud et al. (2009) provide strong empirical evidence that temporary impact follows a square-root law rather than a linear relationship. Under such non-linear impact, the cost-minimising trajectory is more front-loaded than the linear Almgren-Chriss schedule predicts, because the agent should execute faster early to exploit the lower proportional impact of smaller execution rates, and this mis-specification bias grows with order size (Almgren et al., 2005). More broadly, Forsyth, Kennedy, Tse &amp; Windcliff (2012) show that the Almgren-Chriss trajectory is optimal only under its own mean-variance objective and parametric assumptions and can be improved upon under alternative risk criteria. This matters for our research setting because it establishes that even in the single-venue context the Almgren-Chriss benchmark is already sub-optimal by a measurable margin, so the scope for improvement is real and material.</w:t>
       </w:r>
     </w:p>
     <w:p>
@@ -4334,7 +4334,7 @@
           <w:b w:val="0"/>
           <w:i w:val="0"/>
         </w:rPr>
-        <w:t xml:space="preserve"> is the U-shaped intraday seasonality multiplier, taking its peak values at k = 0 (open) and k = K−1 (close) and its minimum at the midday trough. This is parameterised as season_k = 1 − β · sin²(π · k / (K−1)) with β ∈ (0, 1) controlling the depth of the U, consistent with the empirical seasonality documented in European equity markets (Bouchaud et al., 2010).</w:t>
+        <w:t xml:space="preserve"> is the U-shaped intraday seasonality multiplier, taking its peak values at k = 0 (open) and k = K−1 (close) and its minimum at the midday trough. This is parameterised as season_k = 1 − β · sin²(π · k / (K−1)) with β ∈ (0, 1) controlling the depth of the U, consistent with the empirical seasonality documented in European equity markets (Bouchaud et al., 2009).</w:t>
       </w:r>
     </w:p>
     <w:p>
@@ -4346,7 +4346,7 @@
           <w:b w:val="0"/>
           <w:i w:val="0"/>
         </w:rPr>
-        <w:t>Each session draws its annualised σ from one of three regimes, {15%, 22%, 35%}, spanning the calm-to-stressed range documented for CAC 40 names (Banque de France, 2022; ESMA, 2023), with the central level set to the long-run CAC 40 realised volatility. These three discrete regimes are a deliberately parsimonious stand-in for the continuous volatility clustering that GARCH-type models capture (Bollerslev, 1986), chosen here because the hypotheses concern comparative performance across, rather than within, volatility states.</w:t>
+        <w:t>Each session draws its annualised σ from one of three regimes, {15%, 22%, 35%}, spanning the calm-to-stressed range documented for CAC 40 names (ESMA, 2023), with the central level set to the long-run CAC 40 realised volatility. These three discrete regimes are a deliberately parsimonious stand-in for the continuous volatility clustering that GARCH-type models capture (Bollerslev, 1986), chosen here because the hypotheses concern comparative performance across, rather than within, volatility states.</w:t>
       </w:r>
     </w:p>
     <w:p>
@@ -4434,7 +4434,7 @@
           <w:b w:val="0"/>
           <w:i w:val="0"/>
         </w:rPr>
-        <w:t>In the base specification δ = 1 (linear temporary impact). A robustness variant uses δ = 0.5, corresponding to the square-root law of Bouchaud et al. (2010), which is empirically dominant for large institutional orders. The execution price received at step k is therefore S_k + h(u_k) (for a buy order paying the spread and temporary impact), so the cost of executing n_k shares at step k is n_k · [S_k + h(u_k)].</w:t>
+        <w:t>In the base specification δ = 1 (linear temporary impact). A robustness variant uses δ = 0.5, corresponding to the square-root law of Bouchaud et al. (2009), which is empirically dominant for large institutional orders. The execution price received at step k is therefore S_k + h(u_k) (for a buy order paying the spread and temporary impact), so the cost of executing n_k shares at step k is n_k · [S_k + h(u_k)].</w:t>
       </w:r>
     </w:p>
     <w:p>
@@ -4614,7 +4614,7 @@
           <w:b w:val="0"/>
           <w:i w:val="0"/>
         </w:rPr>
-        <w:t>. This lies within the 15-40 bps range reported for institutional European orders by Banque de France (2022) and is consistent with the academic literature on European equity market impact. Because no freely accessible data source provides direct impact estimates for the target universe, these coefficients are literature-based; they are reported transparently in Table B.1 (Appendix B) and subjected to a ±50% sensitivity analysis in Section 4.5.</w:t>
+        <w:t>. This is of the same order as the roughly 20-30 bps average market-impact cost reported for institutional equity trades by Bikker, Spierdijk and van der Sluis (2007) and is consistent with the academic literature on equity market impact. Because no freely accessible data source provides direct impact estimates for the target universe, these coefficients are literature-based; they are reported transparently in Table B.1 (Appendix B) and subjected to a ±50% sensitivity analysis in Section 4.5.</w:t>
       </w:r>
     </w:p>
     <w:p>
@@ -4688,7 +4688,7 @@
           <w:b w:val="0"/>
           <w:i w:val="0"/>
         </w:rPr>
-        <w:t>with |ρ| &lt; 1 ensuring stationarity. The AR(1) structure is the minimal parameterisation that produces the short-horizon serial correlation and mean-reversion of Order Flow Imbalance (OFI), the quantity defined in Chapter 2 as the signed difference between buyer-initiated and seller-initiated volume at the top of the book. Cartea, Donnelly &amp; Jaimungal (2018) and Bouchaud et al. (2010) both document that OFI is positively autocorrelated at the intraday horizon, with autocorrelation decaying over minutes, a pattern captured here by setting ρ = 0.65 (corresponding to a half-life of roughly 1.6 minutes at the one-minute step frequency). Richer self-exciting point-process models of this order-flow persistence (notably Hawkes processes; Bacry, Mastromatteo &amp; Muzy, 2015) are available, but the AR(1) reduction adopted here preserves the essential short-horizon dynamics at far lower parameter cost.</w:t>
+        <w:t>with |ρ| &lt; 1 ensuring stationarity. The AR(1) structure is the minimal parameterisation that produces the short-horizon serial correlation and mean-reversion of Order Flow Imbalance (OFI), the quantity defined in Chapter 2 as the signed difference between buyer-initiated and seller-initiated volume at the top of the book. Cartea, Donnelly &amp; Jaimungal (2018) and Bouchaud et al. (2009) both document that OFI is positively autocorrelated at the intraday horizon, with autocorrelation decaying over minutes, a pattern captured here by setting ρ = 0.65 (corresponding to a half-life of roughly 1.6 minutes at the one-minute step frequency). Richer self-exciting point-process models of this order-flow persistence (notably Hawkes processes; Bacry, Mastromatteo &amp; Muzy, 2015) are available, but the AR(1) reduction adopted here preserves the essential short-horizon dynamics at far lower parameter cost.</w:t>
       </w:r>
     </w:p>
     <w:p>
@@ -5852,7 +5852,7 @@
           <w:b w:val="0"/>
           <w:i w:val="0"/>
         </w:rPr>
-        <w:t>. The null hypothesis for each primary comparison is that the two strategies have equal expected IS (two-sided test at the 5% level). No data-mining correction is applied, as the number of pre-registered comparisons is small (three main hypotheses with their sub-hypotheses, each with a single primary comparison); the absence of such a correction is noted here as a limitation. This pre-registration discipline, combined with the strict train/test separation, is the standard safeguard against the backtest-overfitting risk emphasised by Pardo (2008) and Bailey, Borwein, López de Prado &amp; Zhu (2015).</w:t>
+        <w:t>. The null hypothesis for each primary comparison is that the two strategies have equal expected IS (two-sided test at the 5% level). No data-mining correction is applied, as the number of pre-registered comparisons is small (three main hypotheses with their sub-hypotheses, each with a single primary comparison); the absence of such a correction is noted here as a limitation. This pre-registration discipline, combined with the strict train/test separation, is the standard safeguard against the backtest-overfitting risk emphasised by Pardo (2008) and Bailey, Borwein, López de Prado &amp; Zhu (2017).</w:t>
       </w:r>
     </w:p>
     <w:p>
@@ -10512,7 +10512,7 @@
           <w:b w:val="0"/>
           <w:i w:val="0"/>
         </w:rPr>
-        <w:t>Almgren, R. &amp; Chriss, N. (2001). Optimal execution of portfolio transactions. Journal of Risk, 3(2), 5-39.</w:t>
+        <w:t>Almgren, R., &amp; Chriss, N. (2001). Optimal execution of portfolio transactions. Journal of Risk, 3(2), 5-39.</w:t>
       </w:r>
     </w:p>
     <w:p>
@@ -10525,7 +10525,7 @@
           <w:b w:val="0"/>
           <w:i w:val="0"/>
         </w:rPr>
-        <w:t>Almgren, R., Thum, C., Hauptmann, E. &amp; Li, H. (2005). Direct estimation of equity market impact. Risk, 18(7), 58-62.</w:t>
+        <w:t>Almgren, R., Thum, C., Hauptmann, E., &amp; Li, H. (2005). Direct estimation of equity market impact. Risk, 18(7), 58-62.</w:t>
       </w:r>
     </w:p>
     <w:p>
@@ -10538,7 +10538,7 @@
           <w:b w:val="0"/>
           <w:i w:val="0"/>
         </w:rPr>
-        <w:t>Bacry, E., Mastromatteo, I. &amp; Muzy, J.-F. (2015). Hawkes processes in finance. Market Microstructure and Liquidity, 1(1), 1550005.</w:t>
+        <w:t>Bacry, E., Mastromatteo, I., &amp; Muzy, J.-F. (2015). Hawkes processes in finance. Market Microstructure and Liquidity, 1(1), 1550005.</w:t>
       </w:r>
     </w:p>
     <w:p>
@@ -10551,7 +10551,7 @@
           <w:b w:val="0"/>
           <w:i w:val="0"/>
         </w:rPr>
-        <w:t>Bailey, D. H., Borwein, J., López de Prado, M. &amp; Zhu, Q. J. (2015). The probability of backtest overfitting. Journal of Computational Finance, 20(4), 39-70.</w:t>
+        <w:t>Bailey, D. H., Borwein, J. M., López de Prado, M. M., &amp; Zhu, Q. J. (2017). The probability of backtest overfitting. Journal of Computational Finance, 20(4), 39-69.</w:t>
       </w:r>
     </w:p>
     <w:p>
@@ -10564,7 +10564,7 @@
           <w:b w:val="0"/>
           <w:i w:val="0"/>
         </w:rPr>
-        <w:t>Banque de France (2022). Report on the structure of European equity markets. Autorité des marchés financiers, Paris.</w:t>
+        <w:t>Bellman, R. (1957). Dynamic programming. Princeton University Press.</w:t>
       </w:r>
     </w:p>
     <w:p>
@@ -10577,7 +10577,7 @@
           <w:b w:val="0"/>
           <w:i w:val="0"/>
         </w:rPr>
-        <w:t>Bellman, R. (1957). Dynamic Programming. Princeton University Press.</w:t>
+        <w:t>Berkowitz, S. A., Logue, D. E., &amp; Noser, E. A. (1988). The total cost of transactions on the NYSE. The Journal of Finance, 43(1), 97-112.</w:t>
       </w:r>
     </w:p>
     <w:p>
@@ -10590,7 +10590,7 @@
           <w:b w:val="0"/>
           <w:i w:val="0"/>
         </w:rPr>
-        <w:t>Berkowitz, S. A., Logue, D. E. &amp; Noser, E. A. (1988). The total cost of transactions on the NYSE. The Journal of Finance, 43(1), 97-112.</w:t>
+        <w:t>Bertsimas, D., &amp; Lo, A. W. (1998). Optimal control of execution costs. Journal of Financial Markets, 1(1), 1-50.</w:t>
       </w:r>
     </w:p>
     <w:p>
@@ -10603,7 +10603,7 @@
           <w:b w:val="0"/>
           <w:i w:val="0"/>
         </w:rPr>
-        <w:t>Bertsimas, D. &amp; Lo, A. W. (1998). Optimal control of execution costs. Journal of Financial Markets, 1(1), 1-50.</w:t>
+        <w:t>Bialkowski, J., Darolles, S., &amp; Le Fol, G. (2008). Improving VWAP strategies: A dynamic volume approach. Journal of Banking &amp; Finance, 32(9), 1709-1722.</w:t>
       </w:r>
     </w:p>
     <w:p>
@@ -10616,7 +10616,7 @@
           <w:b w:val="0"/>
           <w:i w:val="0"/>
         </w:rPr>
-        <w:t>Bialkowski, J., Darolles, S. &amp; Le Fol, G. (2008). Improving VWAP strategies: A dynamic volume approach. Journal of Banking &amp; Finance, 32(9), 1709-1722.</w:t>
+        <w:t>Bikker, J. A., Spierdijk, L., &amp; van der Sluis, P. J. (2007). Market impact costs of institutional equity trades. Journal of International Money and Finance, 26(6), 974-1000.</w:t>
       </w:r>
     </w:p>
     <w:p>
@@ -10642,7 +10642,7 @@
           <w:b w:val="0"/>
           <w:i w:val="0"/>
         </w:rPr>
-        <w:t>Bouchaud, J.-P., Farmer, J. D. &amp; Lillo, F. (2010). How markets slowly digest changes in supply and demand. In Handbook of Financial Markets: Dynamics and Evolution. North-Holland.</w:t>
+        <w:t>Bouchaud, J.-P., Farmer, J. D., &amp; Lillo, F. (2009). How markets slowly digest changes in supply and demand. In T. Hens &amp; K. R. Schenk-Hoppé (Eds.), Handbook of financial markets: Dynamics and evolution (pp. 57-156). North-Holland.</w:t>
       </w:r>
     </w:p>
     <w:p>
@@ -10655,7 +10655,7 @@
           <w:b w:val="0"/>
           <w:i w:val="0"/>
         </w:rPr>
-        <w:t>Cartea, A. &amp; Jaimungal, S. (2015). Optimal execution with limit and market orders. Quantitative Finance, 15(8), 1279-1291.</w:t>
+        <w:t>Cartea, Á., &amp; Jaimungal, S. (2015). Optimal execution with limit and market orders. Quantitative Finance, 15(8), 1279-1291.</w:t>
       </w:r>
     </w:p>
     <w:p>
@@ -10668,7 +10668,7 @@
           <w:b w:val="0"/>
           <w:i w:val="0"/>
         </w:rPr>
-        <w:t>Cartea, Á., Donnelly, R. &amp; Jaimungal, S. (2018). Enhancing trading strategies with order book signals. Applied Mathematical Finance, 25(1), 1-35.</w:t>
+        <w:t>Cartea, Á., Donnelly, R., &amp; Jaimungal, S. (2018). Enhancing trading strategies with order book signals. Applied Mathematical Finance, 25(1), 1-35.</w:t>
       </w:r>
     </w:p>
     <w:p>
@@ -10681,7 +10681,7 @@
           <w:b w:val="0"/>
           <w:i w:val="0"/>
         </w:rPr>
-        <w:t>Cont, R., Kukanov, A. &amp; Stoikov, S. (2014). The price impact of order book events. Journal of Financial Econometrics, 12(1), 47-88.</w:t>
+        <w:t>Cont, R., Kukanov, A., &amp; Stoikov, S. (2014). The price impact of order book events. Journal of Financial Econometrics, 12(1), 47-88.</w:t>
       </w:r>
     </w:p>
     <w:p>
@@ -10694,7 +10694,7 @@
           <w:b w:val="0"/>
           <w:i w:val="0"/>
         </w:rPr>
-        <w:t>Degryse, H., De Jong, F. &amp; van Kervel, V. (2015). The impact of dark trading and visible fragmentation on market quality. Review of Finance, 19(4), 1587-1622.</w:t>
+        <w:t>Degryse, H., De Jong, F., &amp; van Kervel, V. (2015). The impact of dark trading and visible fragmentation on market quality. Review of Finance, 19(4), 1587-1622.</w:t>
       </w:r>
     </w:p>
     <w:p>
@@ -10733,7 +10733,7 @@
           <w:b w:val="0"/>
           <w:i w:val="0"/>
         </w:rPr>
-        <w:t>Easley, D., López de Prado, M. M. &amp; O'Hara, M. (2012). Flow toxicity and liquidity in a high-frequency world. The Review of Financial Studies, 25(5), 1457-1493.</w:t>
+        <w:t>Easley, D., López de Prado, M. M., &amp; O'Hara, M. (2012). Flow toxicity and liquidity in a high-frequency world. The Review of Financial Studies, 25(5), 1457-1493.</w:t>
       </w:r>
     </w:p>
     <w:p>
@@ -10746,7 +10746,7 @@
           <w:b w:val="0"/>
           <w:i w:val="0"/>
         </w:rPr>
-        <w:t>ESMA (2023). Annual Statistical Report on EU Securities Markets. European Securities and Markets Authority, Paris.</w:t>
+        <w:t>ESMA (2023). EU Securities Markets: Annual Statistical Report 2023. European Securities and Markets Authority, Paris.</w:t>
       </w:r>
     </w:p>
     <w:p>
@@ -10772,7 +10772,7 @@
           <w:b w:val="0"/>
           <w:i w:val="0"/>
         </w:rPr>
-        <w:t>Forsyth, P., Kennedy, J., Tse, S. &amp; Ware, T. (2012). Optimal trade execution and absence of price manipulations in limit order book models. SIAM Journal on Financial Mathematics, 3(1), 163-196.</w:t>
+        <w:t>Forsyth, P., Kennedy, J., Tse, S., &amp; Windcliff, H. (2012). Optimal trade execution: a mean-quadratic-variation approach. Journal of Economic Dynamics and Control, 36(12), 1971-1991.</w:t>
       </w:r>
     </w:p>
     <w:p>
@@ -10785,7 +10785,7 @@
           <w:b w:val="0"/>
           <w:i w:val="0"/>
         </w:rPr>
-        <w:t>Glosten, L. R. &amp; Milgrom, P. R. (1985). Bid, ask and transaction prices in a specialist market with heterogeneously informed traders. Journal of Financial Economics, 14(1), 71-100.</w:t>
+        <w:t>Glosten, L. R., &amp; Milgrom, P. R. (1985). Bid, ask and transaction prices in a specialist market with heterogeneously informed traders. Journal of Financial Economics, 14(1), 71-100.</w:t>
       </w:r>
     </w:p>
     <w:p>
@@ -10837,7 +10837,7 @@
           <w:b w:val="0"/>
           <w:i w:val="0"/>
         </w:rPr>
-        <w:t>Hautsch, N. &amp; Huang, R. (2012). The market impact of a limit order. Journal of Economic Dynamics and Control, 36(4), 501-522.</w:t>
+        <w:t>Hautsch, N., &amp; Huang, R. (2012). The market impact of a limit order. Journal of Economic Dynamics and Control, 36(4), 501-522.</w:t>
       </w:r>
     </w:p>
     <w:p>
@@ -10850,7 +10850,7 @@
           <w:b w:val="0"/>
           <w:i w:val="0"/>
         </w:rPr>
-        <w:t>Hendricks, D. &amp; Wilcox, D. (2014). A reinforcement learning extension to the Almgren-Chriss framework for optimal trade execution. IEEE Conference on Computational Intelligence for Financial Engineering &amp; Economics (CIFEr), 457-464.</w:t>
+        <w:t>Hendricks, D., &amp; Wilcox, D. (2014). A reinforcement learning extension to the Almgren-Chriss framework for optimal trade execution. IEEE Conference on Computational Intelligence for Financial Engineering &amp; Economics (CIFEr), 457-464.</w:t>
       </w:r>
     </w:p>
     <w:p>
@@ -10863,7 +10863,7 @@
           <w:b w:val="0"/>
           <w:i w:val="0"/>
         </w:rPr>
-        <w:t>Kissell, R. &amp; Malamut, R. (2006). Algorithmic decision-making framework. Journal of Trading, 1(1), 12-21.</w:t>
+        <w:t>Kissell, R., &amp; Malamut, R. (2006). Algorithmic decision-making framework. Journal of Trading, 1(1), 12-21.</w:t>
       </w:r>
     </w:p>
     <w:p>
@@ -10889,7 +10889,7 @@
           <w:b w:val="0"/>
           <w:i w:val="0"/>
         </w:rPr>
-        <w:t>Lagoudakis, M. G. &amp; Parr, R. (2003). Least-squares policy iteration. Journal of Machine Learning Research, 4, 1107-1149.</w:t>
+        <w:t>Lagoudakis, M. G., &amp; Parr, R. (2003). Least-squares policy iteration. Journal of Machine Learning Research, 4, 1107-1149.</w:t>
       </w:r>
     </w:p>
     <w:p>
@@ -10902,7 +10902,7 @@
           <w:b w:val="0"/>
           <w:i w:val="0"/>
         </w:rPr>
-        <w:t>Laruelle, S., Lehalle, C.-A. &amp; Pagès, G. (2011). Optimal split of orders across liquidity pools. SIAM Journal on Financial Mathematics, 2(1), 1042-1076.</w:t>
+        <w:t>Laruelle, S., Lehalle, C.-A., &amp; Pagès, G. (2011). Optimal split of orders across liquidity pools: A stochastic algorithm approach. SIAM Journal on Financial Mathematics, 2(1), 1042-1076.</w:t>
       </w:r>
     </w:p>
     <w:p>
@@ -10915,7 +10915,7 @@
           <w:b w:val="0"/>
           <w:i w:val="0"/>
         </w:rPr>
-        <w:t>Lehalle, C.-A. &amp; Laruelle, S. (Eds.) (2013). Market Microstructure in Practice. World Scientific.</w:t>
+        <w:t>Lehalle, C.-A., &amp; Laruelle, S. (Eds.) (2013). Market microstructure in practice. World Scientific.</w:t>
       </w:r>
     </w:p>
     <w:p>
@@ -10941,7 +10941,7 @@
           <w:b w:val="0"/>
           <w:i w:val="0"/>
         </w:rPr>
-        <w:t>Mnih, V., Kavukcuoglu, K., Silver, D., Rusu, A. A., Veness, J., Bellemare, M. G., Graves, A., Riedmiller, M., Fidjeland, A. K., Ostrovski, G., Petersen, S., Beattie, C., Sadik, A., Antonoglou, I., King, H., Kumaran, D., Wierstra, D., Legg, S. &amp; Hassabis, D. (2015). Human-level control through deep reinforcement learning. Nature, 518, 529-533.</w:t>
+        <w:t>Mnih, V., Kavukcuoglu, K., Silver, D., Rusu, A. A., Veness, J., Bellemare, M. G., Graves, A., Riedmiller, M., Fidjeland, A. K., Ostrovski, G., Petersen, S., Beattie, C., Sadik, A., Antonoglou, I., King, H., Kumaran, D., Wierstra, D., Legg, S., &amp; Hassabis, D. (2015). Human-level control through deep reinforcement learning. Nature, 518, 529-533.</w:t>
       </w:r>
     </w:p>
     <w:p>
@@ -10954,7 +10954,7 @@
           <w:b w:val="0"/>
           <w:i w:val="0"/>
         </w:rPr>
-        <w:t>Moody, J. &amp; Saffell, M. (2001). Learning to trade via direct reinforcement. IEEE Transactions on Neural Networks, 12(4), 875-889.</w:t>
+        <w:t>Moody, J., &amp; Saffell, M. (2001). Learning to trade via direct reinforcement. IEEE Transactions on Neural Networks, 12(4), 875-889.</w:t>
       </w:r>
     </w:p>
     <w:p>
@@ -10967,7 +10967,7 @@
           <w:b w:val="0"/>
           <w:i w:val="0"/>
         </w:rPr>
-        <w:t>Nevmyvaka, Y., Feng, Y. &amp; Kearns, M. (2006). Reinforcement learning for optimized trade execution. Proceedings of the 23rd ICML, 673-680.</w:t>
+        <w:t>Nevmyvaka, Y., Feng, Y., &amp; Kearns, M. (2006). Reinforcement learning for optimized trade execution. Proceedings of the 23rd ICML, 673-680.</w:t>
       </w:r>
     </w:p>
     <w:p>
@@ -10980,7 +10980,7 @@
           <w:b w:val="0"/>
           <w:i w:val="0"/>
         </w:rPr>
-        <w:t>Newey, W. K. &amp; West, K. D. (1987). A simple, positive semi-definite, heteroskedasticity and autocorrelation consistent covariance matrix. Econometrica, 55(3), 703-708.</w:t>
+        <w:t>Newey, W. K., &amp; West, K. D. (1987). A simple, positive semi-definite, heteroskedasticity and autocorrelation consistent covariance matrix. Econometrica, 55(3), 703-708.</w:t>
       </w:r>
     </w:p>
     <w:p>
@@ -10993,7 +10993,7 @@
           <w:b w:val="0"/>
           <w:i w:val="0"/>
         </w:rPr>
-        <w:t>Ning, B., Lin, F. H. T. &amp; Jaimungal, S. (2021). Double deep Q-learning for optimal execution. Applied Mathematical Finance, 28(4), 361-380.</w:t>
+        <w:t>Ning, B., Lin, F. H. T., &amp; Jaimungal, S. (2021). Double deep Q-learning for optimal execution. Applied Mathematical Finance, 28(4), 361-380.</w:t>
       </w:r>
     </w:p>
     <w:p>
@@ -11006,7 +11006,7 @@
           <w:b w:val="0"/>
           <w:i w:val="0"/>
         </w:rPr>
-        <w:t>O'Hara, M. &amp; Ye, M. (2011). Is market fragmentation harming market quality? Journal of Financial Economics, 100(3), 459-474.</w:t>
+        <w:t>O'Hara, M., &amp; Ye, M. (2011). Is market fragmentation harming market quality? Journal of Financial Economics, 100(3), 459-474.</w:t>
       </w:r>
     </w:p>
     <w:p>
@@ -11019,7 +11019,7 @@
           <w:b w:val="0"/>
           <w:i w:val="0"/>
         </w:rPr>
-        <w:t>Pardo, R. (2008). The Evaluation and Optimization of Trading Strategies (2nd ed.). John Wiley &amp; Sons.</w:t>
+        <w:t>Pardo, R. (2008). The evaluation and optimization of trading strategies (2nd ed.). John Wiley &amp; Sons.</w:t>
       </w:r>
     </w:p>
     <w:p>
@@ -11045,7 +11045,7 @@
           <w:b w:val="0"/>
           <w:i w:val="0"/>
         </w:rPr>
-        <w:t>Popper, K. (1959). The Logic of Scientific Discovery. Hutchinson.</w:t>
+        <w:t>Popper, K. (1959). The logic of scientific discovery. Hutchinson.</w:t>
       </w:r>
     </w:p>
     <w:p>
@@ -11058,7 +11058,7 @@
           <w:b w:val="0"/>
           <w:i w:val="0"/>
         </w:rPr>
-        <w:t>Schulman, J., Levine, S., Abbeel, P., Jordan, M. &amp; Moritz, P. (2015). Trust region policy optimization. Proceedings of the 32nd International Conference on Machine Learning (ICML), 1889-1897.</w:t>
+        <w:t>Schulman, J., Levine, S., Abbeel, P., Jordan, M., &amp; Moritz, P. (2015). Trust region policy optimization. Proceedings of the 32nd International Conference on Machine Learning (ICML), 1889-1897.</w:t>
       </w:r>
     </w:p>
     <w:p>
@@ -11071,7 +11071,7 @@
           <w:b w:val="0"/>
           <w:i w:val="0"/>
         </w:rPr>
-        <w:t>Schulman, J., Moritz, P., Levine, S., Jordan, M. &amp; Abbeel, P. (2016). High-dimensional continuous control using generalized advantage estimation. Proceedings of ICLR 2016.</w:t>
+        <w:t>Schulman, J., Moritz, P., Levine, S., Jordan, M., &amp; Abbeel, P. (2016). High-dimensional continuous control using generalized advantage estimation. Proceedings of ICLR 2016.</w:t>
       </w:r>
     </w:p>
     <w:p>
@@ -11084,7 +11084,7 @@
           <w:b w:val="0"/>
           <w:i w:val="0"/>
         </w:rPr>
-        <w:t>Schulman, J., Wolski, F., Dhariwal, P., Radford, A. &amp; Klimov, O. (2017). Proximal policy optimization algorithms. arXiv preprint arXiv:1707.06347.</w:t>
+        <w:t>Schulman, J., Wolski, F., Dhariwal, P., Radford, A., &amp; Klimov, O. (2017). Proximal policy optimization algorithms. arXiv preprint arXiv:1707.06347.</w:t>
       </w:r>
     </w:p>
     <w:p>
@@ -11097,7 +11097,7 @@
           <w:b w:val="0"/>
           <w:i w:val="0"/>
         </w:rPr>
-        <w:t>Silver, D., Huang, A., Maddison, C. J., Guez, A., Sifre, L., van den Driessche, G., Schrittwieser, J., Antonoglou, I., Panneershelvam, V., Lanctot, M., Dieleman, S., Grewe, D., Nham, J., Kalchbrenner, N., Sutskever, I., Lillicrap, T., Leach, M., Kavukcuoglu, K., Graepel, T. &amp; Hassabis, D. (2016). Mastering the game of Go with deep neural networks and tree search. Nature, 529, 484-489.</w:t>
+        <w:t>Silver, D., Huang, A., Maddison, C. J., Guez, A., Sifre, L., van den Driessche, G., Schrittwieser, J., Antonoglou, I., Panneershelvam, V., Lanctot, M., Dieleman, S., Grewe, D., Nham, J., Kalchbrenner, N., Sutskever, I., Lillicrap, T., Leach, M., Kavukcuoglu, K., Graepel, T., &amp; Hassabis, D. (2016). Mastering the game of Go with deep neural networks and tree search. Nature, 529, 484-489.</w:t>
       </w:r>
     </w:p>
     <w:p>
@@ -11110,7 +11110,7 @@
           <w:b w:val="0"/>
           <w:i w:val="0"/>
         </w:rPr>
-        <w:t>Spooner, T., Fearnley, J., Savani, R. &amp; Koukorinis, A. (2018). Market making via reinforcement learning. Proceedings of AAMAS 2018, 434-442.</w:t>
+        <w:t>Spooner, T., Fearnley, J., Savani, R., &amp; Koukorinis, A. (2018). Market making via reinforcement learning. Proceedings of AAMAS 2018, 434-442.</w:t>
       </w:r>
     </w:p>
     <w:p>
@@ -11123,7 +11123,7 @@
           <w:b w:val="0"/>
           <w:i w:val="0"/>
         </w:rPr>
-        <w:t>Sutton, R. S. &amp; Barto, A. G. (2018). Reinforcement Learning: An Introduction (2nd ed.). MIT Press.</w:t>
+        <w:t>Sutton, R. S., &amp; Barto, A. G. (2018). Reinforcement learning: An introduction (2nd ed.). MIT Press.</w:t>
       </w:r>
     </w:p>
     <w:p>
@@ -11136,7 +11136,7 @@
           <w:b w:val="0"/>
           <w:i w:val="0"/>
         </w:rPr>
-        <w:t>van Hasselt, H., Guez, A. &amp; Silver, D. (2015). Deep reinforcement learning with double Q-learning. Proceedings of AAAI 2016, 2094-2100.</w:t>
+        <w:t>van Hasselt, H., Guez, A., &amp; Silver, D. (2015). Deep reinforcement learning with double Q-learning. Proceedings of AAAI 2016, 2094-2100.</w:t>
       </w:r>
     </w:p>
     <w:p>

</xml_diff>